<commit_message>
Add organization people admin: create users, assign roles, revoke access.
Co-authored-by: Cursor <cursoragent@cursor.com>
</commit_message>
<xml_diff>
--- a/Руководство администратора.docx
+++ b/Руководство администратора.docx
@@ -2,7 +2,7 @@
 <file path=word/document.xml><?xml version="1.0" encoding="utf-8"?>
 <w:document xmlns:w="http://schemas.openxmlformats.org/wordprocessingml/2006/main" xmlns:m="http://schemas.openxmlformats.org/officeDocument/2006/math" xmlns:r="http://schemas.openxmlformats.org/officeDocument/2006/relationships" xmlns:o="urn:schemas-microsoft-com:office:office" xmlns:v="urn:schemas-microsoft-com:vml" xmlns:w10="urn:schemas-microsoft-com:office:word" xmlns:a="http://schemas.openxmlformats.org/drawingml/2006/main" xmlns:pic="http://schemas.openxmlformats.org/drawingml/2006/picture" xmlns:wp="http://schemas.openxmlformats.org/drawingml/2006/wordprocessingDrawing">
   <w:body>
-    <w:bookmarkStart w:id="40" w:name="инструкция-администратора-fullcrm"/>
+    <w:bookmarkStart w:id="41" w:name="инструкция-администратора-fullcrm"/>
     <w:p>
       <w:pPr>
         <w:pStyle w:val="Heading1"/>
@@ -16,7 +16,7 @@
         <w:pStyle w:val="FirstParagraph"/>
       </w:pPr>
       <w:r>
-        <w:t xml:space="preserve">Документ для администратора организации: первичный вход, модули, аналитика и интеграции.</w:t>
+        <w:t xml:space="preserve">Документ для администратора организации: первичный вход, люди и роли, модули, аналитика и интеграции.</w:t>
       </w:r>
     </w:p>
     <w:p>
@@ -302,7 +302,7 @@
               <w:pStyle w:val="Compact"/>
             </w:pPr>
             <w:r>
-              <w:t xml:space="preserve">Настройки</w:t>
+              <w:t xml:space="preserve">Настройки / Люди</w:t>
             </w:r>
           </w:p>
         </w:tc>
@@ -318,6 +318,21 @@
               </w:rPr>
               <w:t xml:space="preserve">/settings</w:t>
             </w:r>
+            <w:r>
+              <w:t xml:space="preserve"> </w:t>
+            </w:r>
+            <w:r>
+              <w:t xml:space="preserve">или</w:t>
+            </w:r>
+            <w:r>
+              <w:t xml:space="preserve"> </w:t>
+            </w:r>
+            <w:r>
+              <w:rPr>
+                <w:rStyle w:val="VerbatimChar"/>
+              </w:rPr>
+              <w:t xml:space="preserve">/settings?tab=users</w:t>
+            </w:r>
           </w:p>
         </w:tc>
       </w:tr>
@@ -397,13 +412,7 @@
               <w:rPr>
                 <w:rStyle w:val="VerbatimChar"/>
               </w:rPr>
-              <w:t xml:space="preserve">/settings</w:t>
-            </w:r>
-            <w:r>
-              <w:t xml:space="preserve"> </w:t>
-            </w:r>
-            <w:r>
-              <w:t xml:space="preserve">(вкладка по умолчанию)</w:t>
+              <w:t xml:space="preserve">/settings?tab=analytics</w:t>
             </w:r>
           </w:p>
         </w:tc>
@@ -417,7 +426,407 @@
       </w:r>
     </w:p>
     <w:bookmarkEnd w:id="9"/>
-    <w:bookmarkStart w:id="10" w:name="модули-организации"/>
+    <w:bookmarkStart w:id="10" w:name="люди-и-роли"/>
+    <w:p>
+      <w:pPr>
+        <w:pStyle w:val="Heading2"/>
+      </w:pPr>
+      <w:r>
+        <w:t xml:space="preserve">1.1. Люди и роли</w:t>
+      </w:r>
+    </w:p>
+    <w:p>
+      <w:pPr>
+        <w:pStyle w:val="FirstParagraph"/>
+      </w:pPr>
+      <w:r>
+        <w:rPr>
+          <w:b/>
+          <w:bCs/>
+        </w:rPr>
+        <w:t xml:space="preserve">Где:</w:t>
+      </w:r>
+      <w:r>
+        <w:t xml:space="preserve"> </w:t>
+      </w:r>
+      <w:r>
+        <w:t xml:space="preserve">Настройки →</w:t>
+      </w:r>
+      <w:r>
+        <w:t xml:space="preserve"> </w:t>
+      </w:r>
+      <w:r>
+        <w:rPr>
+          <w:b/>
+          <w:bCs/>
+        </w:rPr>
+        <w:t xml:space="preserve">Люди</w:t>
+      </w:r>
+      <w:r>
+        <w:br/>
+      </w:r>
+      <w:r>
+        <w:rPr>
+          <w:b/>
+          <w:bCs/>
+        </w:rPr>
+        <w:t xml:space="preserve">URL:</w:t>
+      </w:r>
+      <w:r>
+        <w:t xml:space="preserve"> </w:t>
+      </w:r>
+      <w:r>
+        <w:rPr>
+          <w:rStyle w:val="VerbatimChar"/>
+        </w:rPr>
+        <w:t xml:space="preserve">/settings?tab=users</w:t>
+      </w:r>
+    </w:p>
+    <w:tbl>
+      <w:tblPr>
+        <w:tblStyle w:val="Table"/>
+        <w:tblW w:type="pct" w:w="5000"/>
+        <w:tblLayout w:type="fixed"/>
+        <w:tblLook w:firstRow="1" w:lastRow="0" w:firstColumn="0" w:lastColumn="0" w:noHBand="0" w:noVBand="0" w:val="0020"/>
+      </w:tblPr>
+      <w:tblGrid>
+        <w:gridCol w:w="5280"/>
+        <w:gridCol w:w="2640"/>
+      </w:tblGrid>
+      <w:tr>
+        <w:trPr>
+          <w:tblHeader w:val="on"/>
+        </w:trPr>
+        <w:tc>
+          <w:tcPr/>
+          <w:p>
+            <w:pPr>
+              <w:pStyle w:val="Compact"/>
+            </w:pPr>
+            <w:r>
+              <w:t xml:space="preserve">Действие</w:t>
+            </w:r>
+          </w:p>
+        </w:tc>
+        <w:tc>
+          <w:tcPr/>
+          <w:p>
+            <w:pPr>
+              <w:pStyle w:val="Compact"/>
+            </w:pPr>
+            <w:r>
+              <w:t xml:space="preserve">Как</w:t>
+            </w:r>
+          </w:p>
+        </w:tc>
+      </w:tr>
+      <w:tr>
+        <w:tc>
+          <w:tcPr/>
+          <w:p>
+            <w:pPr>
+              <w:pStyle w:val="Compact"/>
+            </w:pPr>
+            <w:r>
+              <w:t xml:space="preserve">Создать менеджера</w:t>
+            </w:r>
+          </w:p>
+        </w:tc>
+        <w:tc>
+          <w:tcPr/>
+          <w:p>
+            <w:pPr>
+              <w:pStyle w:val="Compact"/>
+            </w:pPr>
+            <w:r>
+              <w:t xml:space="preserve">форма «Создать пользователя»: email, ФИО, пароль ≥8, роли (часто</w:t>
+            </w:r>
+            <w:r>
+              <w:t xml:space="preserve"> </w:t>
+            </w:r>
+            <w:r>
+              <w:rPr>
+                <w:rStyle w:val="VerbatimChar"/>
+              </w:rPr>
+              <w:t xml:space="preserve">manager</w:t>
+            </w:r>
+            <w:r>
+              <w:t xml:space="preserve">)</w:t>
+            </w:r>
+          </w:p>
+        </w:tc>
+      </w:tr>
+      <w:tr>
+        <w:tc>
+          <w:tcPr/>
+          <w:p>
+            <w:pPr>
+              <w:pStyle w:val="Compact"/>
+            </w:pPr>
+            <w:r>
+              <w:t xml:space="preserve">Выдать / сменить роль</w:t>
+            </w:r>
+          </w:p>
+        </w:tc>
+        <w:tc>
+          <w:tcPr/>
+          <w:p>
+            <w:pPr>
+              <w:pStyle w:val="Compact"/>
+            </w:pPr>
+            <w:r>
+              <w:t xml:space="preserve">чекбоксы ролей у пользователя →</w:t>
+            </w:r>
+            <w:r>
+              <w:t xml:space="preserve"> </w:t>
+            </w:r>
+            <w:r>
+              <w:rPr>
+                <w:b/>
+                <w:bCs/>
+              </w:rPr>
+              <w:t xml:space="preserve">Сохранить роли</w:t>
+            </w:r>
+          </w:p>
+        </w:tc>
+      </w:tr>
+      <w:tr>
+        <w:tc>
+          <w:tcPr/>
+          <w:p>
+            <w:pPr>
+              <w:pStyle w:val="Compact"/>
+            </w:pPr>
+            <w:r>
+              <w:t xml:space="preserve">Отозвать доступ</w:t>
+            </w:r>
+          </w:p>
+        </w:tc>
+        <w:tc>
+          <w:tcPr/>
+          <w:p>
+            <w:pPr>
+              <w:pStyle w:val="Compact"/>
+            </w:pPr>
+            <w:r>
+              <w:rPr>
+                <w:b/>
+                <w:bCs/>
+              </w:rPr>
+              <w:t xml:space="preserve">Отозвать доступ</w:t>
+            </w:r>
+            <w:r>
+              <w:t xml:space="preserve"> </w:t>
+            </w:r>
+            <w:r>
+              <w:t xml:space="preserve">(</w:t>
+            </w:r>
+            <w:r>
+              <w:rPr>
+                <w:rStyle w:val="VerbatimChar"/>
+              </w:rPr>
+              <w:t xml:space="preserve">is_active=false</w:t>
+            </w:r>
+            <w:r>
+              <w:t xml:space="preserve">, сессии сбрасываются)</w:t>
+            </w:r>
+          </w:p>
+        </w:tc>
+      </w:tr>
+      <w:tr>
+        <w:tc>
+          <w:tcPr/>
+          <w:p>
+            <w:pPr>
+              <w:pStyle w:val="Compact"/>
+            </w:pPr>
+            <w:r>
+              <w:t xml:space="preserve">Вернуть доступ</w:t>
+            </w:r>
+          </w:p>
+        </w:tc>
+        <w:tc>
+          <w:tcPr/>
+          <w:p>
+            <w:pPr>
+              <w:pStyle w:val="Compact"/>
+            </w:pPr>
+            <w:r>
+              <w:rPr>
+                <w:b/>
+                <w:bCs/>
+              </w:rPr>
+              <w:t xml:space="preserve">Восстановить доступ</w:t>
+            </w:r>
+          </w:p>
+        </w:tc>
+      </w:tr>
+    </w:tbl>
+    <w:p>
+      <w:pPr>
+        <w:pStyle w:val="BodyText"/>
+      </w:pPr>
+      <w:r>
+        <w:t xml:space="preserve">Роли по умолчанию:</w:t>
+      </w:r>
+    </w:p>
+    <w:tbl>
+      <w:tblPr>
+        <w:tblStyle w:val="Table"/>
+        <w:tblW w:type="auto" w:w="0"/>
+        <w:tblLook w:firstRow="1" w:lastRow="0" w:firstColumn="0" w:lastColumn="0" w:noHBand="0" w:noVBand="0" w:val="0020"/>
+      </w:tblPr>
+      <w:tblGrid>
+        <w:gridCol w:w="3960"/>
+        <w:gridCol w:w="3960"/>
+      </w:tblGrid>
+      <w:tr>
+        <w:trPr>
+          <w:tblHeader w:val="on"/>
+        </w:trPr>
+        <w:tc>
+          <w:tcPr/>
+          <w:p>
+            <w:pPr>
+              <w:pStyle w:val="Compact"/>
+            </w:pPr>
+            <w:r>
+              <w:t xml:space="preserve">Роль</w:t>
+            </w:r>
+          </w:p>
+        </w:tc>
+        <w:tc>
+          <w:tcPr/>
+          <w:p>
+            <w:pPr>
+              <w:pStyle w:val="Compact"/>
+            </w:pPr>
+            <w:r>
+              <w:t xml:space="preserve">Назначение</w:t>
+            </w:r>
+          </w:p>
+        </w:tc>
+      </w:tr>
+      <w:tr>
+        <w:tc>
+          <w:tcPr/>
+          <w:p>
+            <w:pPr>
+              <w:pStyle w:val="Compact"/>
+            </w:pPr>
+            <w:r>
+              <w:rPr>
+                <w:rStyle w:val="VerbatimChar"/>
+              </w:rPr>
+              <w:t xml:space="preserve">admin</w:t>
+            </w:r>
+          </w:p>
+        </w:tc>
+        <w:tc>
+          <w:tcPr/>
+          <w:p>
+            <w:pPr>
+              <w:pStyle w:val="Compact"/>
+            </w:pPr>
+            <w:r>
+              <w:t xml:space="preserve">всё +</w:t>
+            </w:r>
+            <w:r>
+              <w:t xml:space="preserve"> </w:t>
+            </w:r>
+            <w:r>
+              <w:rPr>
+                <w:rStyle w:val="VerbatimChar"/>
+              </w:rPr>
+              <w:t xml:space="preserve">admin.manage</w:t>
+            </w:r>
+          </w:p>
+        </w:tc>
+      </w:tr>
+      <w:tr>
+        <w:tc>
+          <w:tcPr/>
+          <w:p>
+            <w:pPr>
+              <w:pStyle w:val="Compact"/>
+            </w:pPr>
+            <w:r>
+              <w:rPr>
+                <w:rStyle w:val="VerbatimChar"/>
+              </w:rPr>
+              <w:t xml:space="preserve">manager</w:t>
+            </w:r>
+          </w:p>
+        </w:tc>
+        <w:tc>
+          <w:tcPr/>
+          <w:p>
+            <w:pPr>
+              <w:pStyle w:val="Compact"/>
+            </w:pPr>
+            <w:r>
+              <w:t xml:space="preserve">CRM + коммуникации + AI/analytics read (без admin)</w:t>
+            </w:r>
+          </w:p>
+        </w:tc>
+      </w:tr>
+      <w:tr>
+        <w:tc>
+          <w:tcPr/>
+          <w:p>
+            <w:pPr>
+              <w:pStyle w:val="Compact"/>
+            </w:pPr>
+            <w:r>
+              <w:rPr>
+                <w:rStyle w:val="VerbatimChar"/>
+              </w:rPr>
+              <w:t xml:space="preserve">analyst</w:t>
+            </w:r>
+          </w:p>
+        </w:tc>
+        <w:tc>
+          <w:tcPr/>
+          <w:p>
+            <w:pPr>
+              <w:pStyle w:val="Compact"/>
+            </w:pPr>
+            <w:r>
+              <w:t xml:space="preserve">чтение CRM/comms + AI/analytics</w:t>
+            </w:r>
+          </w:p>
+        </w:tc>
+      </w:tr>
+    </w:tbl>
+    <w:p>
+      <w:pPr>
+        <w:pStyle w:val="BodyText"/>
+      </w:pPr>
+      <w:r>
+        <w:t xml:space="preserve">Ограничения: нельзя отозвать доступ у себя; нельзя оставить организацию без активного</w:t>
+      </w:r>
+      <w:r>
+        <w:t xml:space="preserve"> </w:t>
+      </w:r>
+      <w:r>
+        <w:rPr>
+          <w:rStyle w:val="VerbatimChar"/>
+        </w:rPr>
+        <w:t xml:space="preserve">admin</w:t>
+      </w:r>
+      <w:r>
+        <w:t xml:space="preserve">.</w:t>
+      </w:r>
+    </w:p>
+    <w:p>
+      <w:r>
+        <w:pict>
+          <v:rect style="width:0;height:1.5pt" o:hralign="center" o:hrstd="t" o:hr="t"/>
+        </w:pict>
+      </w:r>
+    </w:p>
+    <w:bookmarkEnd w:id="10"/>
+    <w:bookmarkStart w:id="11" w:name="модули-организации"/>
     <w:p>
       <w:pPr>
         <w:pStyle w:val="Heading2"/>
@@ -846,8 +1255,8 @@
         </w:pict>
       </w:r>
     </w:p>
-    <w:bookmarkEnd w:id="10"/>
-    <w:bookmarkStart w:id="11" w:name="аналитика-пороги"/>
+    <w:bookmarkEnd w:id="11"/>
+    <w:bookmarkStart w:id="12" w:name="аналитика-пороги"/>
     <w:p>
       <w:pPr>
         <w:pStyle w:val="Heading2"/>
@@ -1119,8 +1528,8 @@
         </w:pict>
       </w:r>
     </w:p>
-    <w:bookmarkEnd w:id="11"/>
-    <w:bookmarkStart w:id="12" w:name="интеграции-обзор"/>
+    <w:bookmarkEnd w:id="12"/>
+    <w:bookmarkStart w:id="13" w:name="интеграции-обзор"/>
     <w:p>
       <w:pPr>
         <w:pStyle w:val="Heading2"/>
@@ -1401,8 +1810,8 @@
         </w:pict>
       </w:r>
     </w:p>
-    <w:bookmarkEnd w:id="12"/>
-    <w:bookmarkStart w:id="23" w:name="telegram"/>
+    <w:bookmarkEnd w:id="13"/>
+    <w:bookmarkStart w:id="24" w:name="telegram"/>
     <w:p>
       <w:pPr>
         <w:pStyle w:val="Heading2"/>
@@ -1411,7 +1820,7 @@
         <w:t xml:space="preserve">5. Telegram</w:t>
       </w:r>
     </w:p>
-    <w:bookmarkStart w:id="13" w:name="что-умеет"/>
+    <w:bookmarkStart w:id="14" w:name="что-умеет"/>
     <w:p>
       <w:pPr>
         <w:pStyle w:val="Heading3"/>
@@ -1527,8 +1936,8 @@
         <w:t xml:space="preserve">— только poll.</w:t>
       </w:r>
     </w:p>
-    <w:bookmarkEnd w:id="13"/>
-    <w:bookmarkStart w:id="15" w:name="создание-бота-веб"/>
+    <w:bookmarkEnd w:id="14"/>
+    <w:bookmarkStart w:id="16" w:name="создание-бота-веб"/>
     <w:p>
       <w:pPr>
         <w:pStyle w:val="Heading3"/>
@@ -1551,7 +1960,7 @@
       <w:r>
         <w:t xml:space="preserve"> </w:t>
       </w:r>
-      <w:hyperlink r:id="rId14">
+      <w:hyperlink r:id="rId15">
         <w:r>
           <w:rPr>
             <w:rStyle w:val="Hyperlink"/>
@@ -1688,8 +2097,8 @@
         <w:t xml:space="preserve">https://api.telegram.org/bot&lt;TOKEN&gt;/getMe</w:t>
       </w:r>
     </w:p>
-    <w:bookmarkEnd w:id="15"/>
-    <w:bookmarkStart w:id="16" w:name="env-на-сервере-обязательно"/>
+    <w:bookmarkEnd w:id="16"/>
+    <w:bookmarkStart w:id="17" w:name="env-на-сервере-обязательно"/>
     <w:p>
       <w:pPr>
         <w:pStyle w:val="Heading3"/>
@@ -1914,8 +2323,8 @@
         <w:t xml:space="preserve">.</w:t>
       </w:r>
     </w:p>
-    <w:bookmarkEnd w:id="16"/>
-    <w:bookmarkStart w:id="17" w:name="режимы-статуса"/>
+    <w:bookmarkEnd w:id="17"/>
+    <w:bookmarkStart w:id="18" w:name="режимы-статуса"/>
     <w:p>
       <w:pPr>
         <w:pStyle w:val="Heading3"/>
@@ -2064,8 +2473,8 @@
         </w:tc>
       </w:tr>
     </w:tbl>
-    <w:bookmarkEnd w:id="17"/>
-    <w:bookmarkStart w:id="20" w:name="привязка-контакта"/>
+    <w:bookmarkEnd w:id="18"/>
+    <w:bookmarkStart w:id="21" w:name="привязка-контакта"/>
     <w:p>
       <w:pPr>
         <w:pStyle w:val="Heading3"/>
@@ -2254,7 +2663,7 @@
       <w:r>
         <w:t xml:space="preserve"> </w:t>
       </w:r>
-      <w:hyperlink r:id="rId18">
+      <w:hyperlink r:id="rId19">
         <w:r>
           <w:rPr>
             <w:rStyle w:val="Hyperlink"/>
@@ -2268,7 +2677,7 @@
       <w:r>
         <w:t xml:space="preserve"> </w:t>
       </w:r>
-      <w:hyperlink r:id="rId19">
+      <w:hyperlink r:id="rId20">
         <w:r>
           <w:rPr>
             <w:rStyle w:val="Hyperlink"/>
@@ -2280,8 +2689,8 @@
         <w:t xml:space="preserve">.</w:t>
       </w:r>
     </w:p>
-    <w:bookmarkEnd w:id="20"/>
-    <w:bookmarkStart w:id="21" w:name="опрос-сообщений"/>
+    <w:bookmarkEnd w:id="21"/>
+    <w:bookmarkStart w:id="22" w:name="опрос-сообщений"/>
     <w:p>
       <w:pPr>
         <w:pStyle w:val="Heading3"/>
@@ -2437,8 +2846,8 @@
         <w:t xml:space="preserve">будет отклонён.</w:t>
       </w:r>
     </w:p>
-    <w:bookmarkEnd w:id="21"/>
-    <w:bookmarkStart w:id="22" w:name="чеклист-telegram"/>
+    <w:bookmarkEnd w:id="22"/>
+    <w:bookmarkStart w:id="23" w:name="чеклист-telegram"/>
     <w:p>
       <w:pPr>
         <w:pStyle w:val="Heading3"/>
@@ -2589,9 +2998,9 @@
         </w:pict>
       </w:r>
     </w:p>
-    <w:bookmarkEnd w:id="22"/>
     <w:bookmarkEnd w:id="23"/>
-    <w:bookmarkStart w:id="29" w:name="openai-модуль-ии"/>
+    <w:bookmarkEnd w:id="24"/>
+    <w:bookmarkStart w:id="30" w:name="openai-модуль-ии"/>
     <w:p>
       <w:pPr>
         <w:pStyle w:val="Heading2"/>
@@ -2600,7 +3009,7 @@
         <w:t xml:space="preserve">6. OpenAI (модуль ИИ)</w:t>
       </w:r>
     </w:p>
-    <w:bookmarkStart w:id="24" w:name="что-умеет-1"/>
+    <w:bookmarkStart w:id="25" w:name="что-умеет-1"/>
     <w:p>
       <w:pPr>
         <w:pStyle w:val="Heading3"/>
@@ -2663,8 +3072,8 @@
         <w:t xml:space="preserve">Режимы: mock / live / degraded</w:t>
       </w:r>
     </w:p>
-    <w:bookmarkEnd w:id="24"/>
-    <w:bookmarkStart w:id="25" w:name="получение-ключа-веб"/>
+    <w:bookmarkEnd w:id="25"/>
+    <w:bookmarkStart w:id="26" w:name="получение-ключа-веб"/>
     <w:p>
       <w:pPr>
         <w:pStyle w:val="Heading3"/>
@@ -2754,8 +3163,8 @@
         <w:t xml:space="preserve">Модели: https://platform.openai.com/docs/models</w:t>
       </w:r>
     </w:p>
-    <w:bookmarkEnd w:id="25"/>
-    <w:bookmarkStart w:id="26" w:name="env-на-сервере"/>
+    <w:bookmarkEnd w:id="26"/>
+    <w:bookmarkStart w:id="27" w:name="env-на-сервере"/>
     <w:p>
       <w:pPr>
         <w:pStyle w:val="Heading3"/>
@@ -3016,8 +3425,8 @@
         <w:t xml:space="preserve">.</w:t>
       </w:r>
     </w:p>
-    <w:bookmarkEnd w:id="26"/>
-    <w:bookmarkStart w:id="27" w:name="включение-в-ui"/>
+    <w:bookmarkEnd w:id="27"/>
+    <w:bookmarkStart w:id="28" w:name="включение-в-ui"/>
     <w:p>
       <w:pPr>
         <w:pStyle w:val="Heading3"/>
@@ -3183,8 +3592,8 @@
         <w:t xml:space="preserve">= ошибка API → fallback.</w:t>
       </w:r>
     </w:p>
-    <w:bookmarkEnd w:id="27"/>
-    <w:bookmarkStart w:id="28" w:name="чеклист-ии"/>
+    <w:bookmarkEnd w:id="28"/>
+    <w:bookmarkStart w:id="29" w:name="чеклист-ии"/>
     <w:p>
       <w:pPr>
         <w:pStyle w:val="Heading3"/>
@@ -3314,9 +3723,9 @@
         </w:pict>
       </w:r>
     </w:p>
-    <w:bookmarkEnd w:id="28"/>
     <w:bookmarkEnd w:id="29"/>
-    <w:bookmarkStart w:id="32" w:name="gmail-stub"/>
+    <w:bookmarkEnd w:id="30"/>
+    <w:bookmarkStart w:id="33" w:name="gmail-stub"/>
     <w:p>
       <w:pPr>
         <w:pStyle w:val="Heading2"/>
@@ -3325,7 +3734,7 @@
         <w:t xml:space="preserve">7. Gmail (stub)</w:t>
       </w:r>
     </w:p>
-    <w:bookmarkStart w:id="30" w:name="текущее-состояние"/>
+    <w:bookmarkStart w:id="31" w:name="текущее-состояние"/>
     <w:p>
       <w:pPr>
         <w:pStyle w:val="Heading3"/>
@@ -3428,8 +3837,8 @@
         <w:t xml:space="preserve">(ручная запись в timeline)</w:t>
       </w:r>
     </w:p>
-    <w:bookmarkEnd w:id="30"/>
-    <w:bookmarkStart w:id="31" w:name="что-понадобится-для-live-перспектива"/>
+    <w:bookmarkEnd w:id="31"/>
+    <w:bookmarkStart w:id="32" w:name="что-понадобится-для-live-перспектива"/>
     <w:p>
       <w:pPr>
         <w:pStyle w:val="Heading3"/>
@@ -3579,9 +3988,9 @@
         </w:pict>
       </w:r>
     </w:p>
-    <w:bookmarkEnd w:id="31"/>
     <w:bookmarkEnd w:id="32"/>
-    <w:bookmarkStart w:id="35" w:name="календарь-stub"/>
+    <w:bookmarkEnd w:id="33"/>
+    <w:bookmarkStart w:id="36" w:name="календарь-stub"/>
     <w:p>
       <w:pPr>
         <w:pStyle w:val="Heading2"/>
@@ -3590,7 +3999,7 @@
         <w:t xml:space="preserve">8. Календарь (stub)</w:t>
       </w:r>
     </w:p>
-    <w:bookmarkStart w:id="33" w:name="текущее-состояние-1"/>
+    <w:bookmarkStart w:id="34" w:name="текущее-состояние-1"/>
     <w:p>
       <w:pPr>
         <w:pStyle w:val="Heading3"/>
@@ -3620,8 +4029,8 @@
         <w:t xml:space="preserve">, синхронизация отложена.</w:t>
       </w:r>
     </w:p>
-    <w:bookmarkEnd w:id="33"/>
-    <w:bookmarkStart w:id="34" w:name="что-понадобится-для-live-перспектива-1"/>
+    <w:bookmarkEnd w:id="34"/>
+    <w:bookmarkStart w:id="35" w:name="что-понадобится-для-live-перспектива-1"/>
     <w:p>
       <w:pPr>
         <w:pStyle w:val="Heading3"/>
@@ -3721,9 +4130,9 @@
         </w:pict>
       </w:r>
     </w:p>
-    <w:bookmarkEnd w:id="34"/>
     <w:bookmarkEnd w:id="35"/>
-    <w:bookmarkStart w:id="36" w:name="ручной-email-в-crm-без-gmail-oauth"/>
+    <w:bookmarkEnd w:id="36"/>
+    <w:bookmarkStart w:id="37" w:name="ручной-email-в-crm-без-gmail-oauth"/>
     <w:p>
       <w:pPr>
         <w:pStyle w:val="Heading2"/>
@@ -3737,34 +4146,7 @@
         <w:pStyle w:val="FirstParagraph"/>
       </w:pPr>
       <w:r>
-        <w:t xml:space="preserve">Пока Gmail stub:</w:t>
-      </w:r>
-    </w:p>
-    <w:p>
-      <w:pPr>
-        <w:pStyle w:val="Compact"/>
-        <w:numPr>
-          <w:ilvl w:val="0"/>
-          <w:numId w:val="1028"/>
-        </w:numPr>
-      </w:pPr>
-      <w:r>
-        <w:t xml:space="preserve">Модуль Коммуникации включён.</w:t>
-      </w:r>
-      <w:r>
-        <w:br/>
-      </w:r>
-    </w:p>
-    <w:p>
-      <w:pPr>
-        <w:pStyle w:val="Compact"/>
-        <w:numPr>
-          <w:ilvl w:val="0"/>
-          <w:numId w:val="1028"/>
-        </w:numPr>
-      </w:pPr>
-      <w:r>
-        <w:t xml:space="preserve">На карточке контакта/сделки создайте сообщение с каналом</w:t>
+        <w:t xml:space="preserve">Пока Gmail stub, переписку можно</w:t>
       </w:r>
       <w:r>
         <w:t xml:space="preserve"> </w:t>
@@ -3774,7 +4156,82 @@
           <w:b/>
           <w:bCs/>
         </w:rPr>
-        <w:t xml:space="preserve">email</w:t>
+        <w:t xml:space="preserve">зафиксировать вручную</w:t>
+      </w:r>
+      <w:r>
+        <w:t xml:space="preserve"> </w:t>
+      </w:r>
+      <w:r>
+        <w:t xml:space="preserve">в UI:</w:t>
+      </w:r>
+    </w:p>
+    <w:p>
+      <w:pPr>
+        <w:pStyle w:val="Compact"/>
+        <w:numPr>
+          <w:ilvl w:val="0"/>
+          <w:numId w:val="1028"/>
+        </w:numPr>
+      </w:pPr>
+      <w:r>
+        <w:t xml:space="preserve">Модуль</w:t>
+      </w:r>
+      <w:r>
+        <w:t xml:space="preserve"> </w:t>
+      </w:r>
+      <w:r>
+        <w:rPr>
+          <w:b/>
+          <w:bCs/>
+        </w:rPr>
+        <w:t xml:space="preserve">Коммуникации</w:t>
+      </w:r>
+      <w:r>
+        <w:t xml:space="preserve"> </w:t>
+      </w:r>
+      <w:r>
+        <w:t xml:space="preserve">включён.</w:t>
+      </w:r>
+      <w:r>
+        <w:br/>
+      </w:r>
+    </w:p>
+    <w:p>
+      <w:pPr>
+        <w:pStyle w:val="Compact"/>
+        <w:numPr>
+          <w:ilvl w:val="0"/>
+          <w:numId w:val="1028"/>
+        </w:numPr>
+      </w:pPr>
+      <w:r>
+        <w:t xml:space="preserve">Откройте карточку</w:t>
+      </w:r>
+      <w:r>
+        <w:t xml:space="preserve"> </w:t>
+      </w:r>
+      <w:r>
+        <w:rPr>
+          <w:b/>
+          <w:bCs/>
+        </w:rPr>
+        <w:t xml:space="preserve">контакта</w:t>
+      </w:r>
+      <w:r>
+        <w:t xml:space="preserve"> </w:t>
+      </w:r>
+      <w:r>
+        <w:t xml:space="preserve">или</w:t>
+      </w:r>
+      <w:r>
+        <w:t xml:space="preserve"> </w:t>
+      </w:r>
+      <w:r>
+        <w:rPr>
+          <w:b/>
+          <w:bCs/>
+        </w:rPr>
+        <w:t xml:space="preserve">сделки</w:t>
       </w:r>
       <w:r>
         <w:t xml:space="preserve">.</w:t>
@@ -3792,7 +4249,64 @@
         </w:numPr>
       </w:pPr>
       <w:r>
-        <w:t xml:space="preserve">Оно попадёт в timeline и EventLog.</w:t>
+        <w:t xml:space="preserve">Блок</w:t>
+      </w:r>
+      <w:r>
+        <w:t xml:space="preserve"> </w:t>
+      </w:r>
+      <w:r>
+        <w:rPr>
+          <w:b/>
+          <w:bCs/>
+        </w:rPr>
+        <w:t xml:space="preserve">Коммуникации</w:t>
+      </w:r>
+      <w:r>
+        <w:t xml:space="preserve"> </w:t>
+      </w:r>
+      <w:r>
+        <w:t xml:space="preserve">→ форма</w:t>
+      </w:r>
+      <w:r>
+        <w:t xml:space="preserve"> </w:t>
+      </w:r>
+      <w:r>
+        <w:rPr>
+          <w:b/>
+          <w:bCs/>
+        </w:rPr>
+        <w:t xml:space="preserve">«Добавить сообщение (email)»</w:t>
+      </w:r>
+      <w:r>
+        <w:t xml:space="preserve">.</w:t>
+      </w:r>
+      <w:r>
+        <w:br/>
+      </w:r>
+    </w:p>
+    <w:p>
+      <w:pPr>
+        <w:pStyle w:val="Compact"/>
+        <w:numPr>
+          <w:ilvl w:val="0"/>
+          <w:numId w:val="1028"/>
+        </w:numPr>
+      </w:pPr>
+      <w:r>
+        <w:t xml:space="preserve">Выберите направление (исходящее / входящее), введите текст →</w:t>
+      </w:r>
+      <w:r>
+        <w:t xml:space="preserve"> </w:t>
+      </w:r>
+      <w:r>
+        <w:rPr>
+          <w:b/>
+          <w:bCs/>
+        </w:rPr>
+        <w:t xml:space="preserve">Сохранить в timeline</w:t>
+      </w:r>
+      <w:r>
+        <w:t xml:space="preserve">.</w:t>
       </w:r>
     </w:p>
     <w:p>
@@ -3800,7 +4314,29 @@
         <w:pStyle w:val="FirstParagraph"/>
       </w:pPr>
       <w:r>
-        <w:t xml:space="preserve">Это не замена почтового ящика — только фиксация переписки в CRM.</w:t>
+        <w:t xml:space="preserve">Сообщение появится в ленте коммуникаций и в событиях CRM.</w:t>
+      </w:r>
+      <w:r>
+        <w:br/>
+      </w:r>
+      <w:r>
+        <w:t xml:space="preserve">Письмо из реального почтового ящика</w:t>
+      </w:r>
+      <w:r>
+        <w:t xml:space="preserve"> </w:t>
+      </w:r>
+      <w:r>
+        <w:rPr>
+          <w:b/>
+          <w:bCs/>
+        </w:rPr>
+        <w:t xml:space="preserve">не отправляется</w:t>
+      </w:r>
+      <w:r>
+        <w:t xml:space="preserve"> </w:t>
+      </w:r>
+      <w:r>
+        <w:t xml:space="preserve">— это запись в CRM, не SMTP/Gmail.</w:t>
       </w:r>
     </w:p>
     <w:p>
@@ -3810,8 +4346,8 @@
         </w:pict>
       </w:r>
     </w:p>
-    <w:bookmarkEnd w:id="36"/>
-    <w:bookmarkStart w:id="37" w:name="типовой-сценарий-настройки-с-нуля-admin"/>
+    <w:bookmarkEnd w:id="37"/>
+    <w:bookmarkStart w:id="38" w:name="типовой-сценарий-настройки-с-нуля-admin"/>
     <w:p>
       <w:pPr>
         <w:pStyle w:val="Heading2"/>
@@ -4060,8 +4596,8 @@
         </w:pict>
       </w:r>
     </w:p>
-    <w:bookmarkEnd w:id="37"/>
-    <w:bookmarkStart w:id="38" w:name="где-что-править-кратко"/>
+    <w:bookmarkEnd w:id="38"/>
+    <w:bookmarkStart w:id="39" w:name="где-что-править-кратко"/>
     <w:p>
       <w:pPr>
         <w:pStyle w:val="Heading2"/>
@@ -4420,8 +4956,8 @@
         </w:pict>
       </w:r>
     </w:p>
-    <w:bookmarkEnd w:id="38"/>
-    <w:bookmarkStart w:id="39" w:name="полезные-ссылки-сводка"/>
+    <w:bookmarkEnd w:id="39"/>
+    <w:bookmarkStart w:id="40" w:name="полезные-ссылки-сводка"/>
     <w:p>
       <w:pPr>
         <w:pStyle w:val="Heading2"/>
@@ -4800,8 +5336,8 @@
         <w:t xml:space="preserve">Версия инструкции соответствует MVP FullCRM с модулями CRM / Communications / Analytics / AI и интеграциями Telegram (live) + Gmail/Calendar (stub).</w:t>
       </w:r>
     </w:p>
-    <w:bookmarkEnd w:id="39"/>
     <w:bookmarkEnd w:id="40"/>
+    <w:bookmarkEnd w:id="41"/>
     <w:sectPr>
       <w:footnotePr>
         <w:numRestart w:val="eachSect"/>

</xml_diff>

<commit_message>
Document people admin (create user, roles, revoke) in admin guide.
Co-authored-by: Cursor <cursoragent@cursor.com>
</commit_message>
<xml_diff>
--- a/Руководство администратора.docx
+++ b/Руководство администратора.docx
@@ -2,7 +2,7 @@
 <file path=word/document.xml><?xml version="1.0" encoding="utf-8"?>
 <w:document xmlns:w="http://schemas.openxmlformats.org/wordprocessingml/2006/main" xmlns:m="http://schemas.openxmlformats.org/officeDocument/2006/math" xmlns:r="http://schemas.openxmlformats.org/officeDocument/2006/relationships" xmlns:o="urn:schemas-microsoft-com:office:office" xmlns:v="urn:schemas-microsoft-com:vml" xmlns:w10="urn:schemas-microsoft-com:office:word" xmlns:a="http://schemas.openxmlformats.org/drawingml/2006/main" xmlns:pic="http://schemas.openxmlformats.org/drawingml/2006/picture" xmlns:wp="http://schemas.openxmlformats.org/drawingml/2006/wordprocessingDrawing">
   <w:body>
-    <w:bookmarkStart w:id="41" w:name="инструкция-администратора-fullcrm"/>
+    <w:bookmarkStart w:id="46" w:name="инструкция-администратора-fullcrm"/>
     <w:p>
       <w:pPr>
         <w:pStyle w:val="Heading1"/>
@@ -426,13 +426,13 @@
       </w:r>
     </w:p>
     <w:bookmarkEnd w:id="9"/>
-    <w:bookmarkStart w:id="10" w:name="люди-и-роли"/>
+    <w:bookmarkStart w:id="15" w:name="X3a3b71194b2e8038f9618a6658f8a883a1e8117"/>
     <w:p>
       <w:pPr>
         <w:pStyle w:val="Heading2"/>
       </w:pPr>
       <w:r>
-        <w:t xml:space="preserve">1.1. Люди и роли</w:t>
+        <w:t xml:space="preserve">1.1. Люди и роли (создать менеджера / выдать роль / отозвать доступ)</w:t>
       </w:r>
     </w:p>
     <w:p>
@@ -463,6 +463,12 @@
         <w:t xml:space="preserve">Люди</w:t>
       </w:r>
       <w:r>
+        <w:t xml:space="preserve"> </w:t>
+      </w:r>
+      <w:r>
+        <w:t xml:space="preserve">(вкладка по умолчанию)</w:t>
+      </w:r>
+      <w:r>
         <w:br/>
       </w:r>
       <w:r>
@@ -476,10 +482,437 @@
         <w:t xml:space="preserve"> </w:t>
       </w:r>
       <w:r>
+        <w:t xml:space="preserve">https://testfullcrm.alexklyvibe.ru/settings?tab=users</w:t>
+      </w:r>
+      <w:r>
+        <w:br/>
+      </w:r>
+      <w:r>
+        <w:rPr>
+          <w:b/>
+          <w:bCs/>
+        </w:rPr>
+        <w:t xml:space="preserve">Права:</w:t>
+      </w:r>
+      <w:r>
+        <w:t xml:space="preserve"> </w:t>
+      </w:r>
+      <w:r>
+        <w:t xml:space="preserve">только с</w:t>
+      </w:r>
+      <w:r>
+        <w:t xml:space="preserve"> </w:t>
+      </w:r>
+      <w:r>
         <w:rPr>
           <w:rStyle w:val="VerbatimChar"/>
         </w:rPr>
-        <w:t xml:space="preserve">/settings?tab=users</w:t>
+        <w:t xml:space="preserve">admin.manage</w:t>
+      </w:r>
+      <w:r>
+        <w:t xml:space="preserve">.</w:t>
+      </w:r>
+    </w:p>
+    <w:p>
+      <w:pPr>
+        <w:pStyle w:val="BodyText"/>
+      </w:pPr>
+      <w:r>
+        <w:t xml:space="preserve">Роли</w:t>
+      </w:r>
+      <w:r>
+        <w:t xml:space="preserve"> </w:t>
+      </w:r>
+      <w:r>
+        <w:rPr>
+          <w:rStyle w:val="VerbatimChar"/>
+        </w:rPr>
+        <w:t xml:space="preserve">admin</w:t>
+      </w:r>
+      <w:r>
+        <w:t xml:space="preserve"> </w:t>
+      </w:r>
+      <w:r>
+        <w:t xml:space="preserve">/</w:t>
+      </w:r>
+      <w:r>
+        <w:t xml:space="preserve"> </w:t>
+      </w:r>
+      <w:r>
+        <w:rPr>
+          <w:rStyle w:val="VerbatimChar"/>
+        </w:rPr>
+        <w:t xml:space="preserve">manager</w:t>
+      </w:r>
+      <w:r>
+        <w:t xml:space="preserve"> </w:t>
+      </w:r>
+      <w:r>
+        <w:t xml:space="preserve">/</w:t>
+      </w:r>
+      <w:r>
+        <w:t xml:space="preserve"> </w:t>
+      </w:r>
+      <w:r>
+        <w:rPr>
+          <w:rStyle w:val="VerbatimChar"/>
+        </w:rPr>
+        <w:t xml:space="preserve">analyst</w:t>
+      </w:r>
+      <w:r>
+        <w:t xml:space="preserve"> </w:t>
+      </w:r>
+      <w:r>
+        <w:t xml:space="preserve">создаются в организации автоматически при первом открытии этого раздела (или вызове API).</w:t>
+      </w:r>
+    </w:p>
+    <w:bookmarkStart w:id="10" w:name="создать-менеджера"/>
+    <w:p>
+      <w:pPr>
+        <w:pStyle w:val="Heading3"/>
+      </w:pPr>
+      <w:r>
+        <w:t xml:space="preserve">Создать менеджера</w:t>
+      </w:r>
+    </w:p>
+    <w:p>
+      <w:pPr>
+        <w:pStyle w:val="Compact"/>
+        <w:numPr>
+          <w:ilvl w:val="0"/>
+          <w:numId w:val="1002"/>
+        </w:numPr>
+      </w:pPr>
+      <w:r>
+        <w:t xml:space="preserve">Откройте</w:t>
+      </w:r>
+      <w:r>
+        <w:t xml:space="preserve"> </w:t>
+      </w:r>
+      <w:r>
+        <w:rPr>
+          <w:b/>
+          <w:bCs/>
+        </w:rPr>
+        <w:t xml:space="preserve">Настройки → Люди</w:t>
+      </w:r>
+      <w:r>
+        <w:t xml:space="preserve">.</w:t>
+      </w:r>
+    </w:p>
+    <w:p>
+      <w:pPr>
+        <w:pStyle w:val="Compact"/>
+        <w:numPr>
+          <w:ilvl w:val="0"/>
+          <w:numId w:val="1002"/>
+        </w:numPr>
+      </w:pPr>
+      <w:r>
+        <w:t xml:space="preserve">В блоке</w:t>
+      </w:r>
+      <w:r>
+        <w:t xml:space="preserve"> </w:t>
+      </w:r>
+      <w:r>
+        <w:rPr>
+          <w:b/>
+          <w:bCs/>
+        </w:rPr>
+        <w:t xml:space="preserve">Создать пользователя</w:t>
+      </w:r>
+      <w:r>
+        <w:t xml:space="preserve"> </w:t>
+      </w:r>
+      <w:r>
+        <w:t xml:space="preserve">заполните:</w:t>
+      </w:r>
+    </w:p>
+    <w:p>
+      <w:pPr>
+        <w:pStyle w:val="Compact"/>
+        <w:numPr>
+          <w:ilvl w:val="1"/>
+          <w:numId w:val="1003"/>
+        </w:numPr>
+      </w:pPr>
+      <w:r>
+        <w:rPr>
+          <w:b/>
+          <w:bCs/>
+        </w:rPr>
+        <w:t xml:space="preserve">Email</w:t>
+      </w:r>
+      <w:r>
+        <w:t xml:space="preserve"> </w:t>
+      </w:r>
+      <w:r>
+        <w:t xml:space="preserve">— логин (уникален в организации);</w:t>
+      </w:r>
+    </w:p>
+    <w:p>
+      <w:pPr>
+        <w:pStyle w:val="Compact"/>
+        <w:numPr>
+          <w:ilvl w:val="1"/>
+          <w:numId w:val="1003"/>
+        </w:numPr>
+      </w:pPr>
+      <w:r>
+        <w:rPr>
+          <w:b/>
+          <w:bCs/>
+        </w:rPr>
+        <w:t xml:space="preserve">ФИО</w:t>
+      </w:r>
+      <w:r>
+        <w:t xml:space="preserve">;</w:t>
+      </w:r>
+    </w:p>
+    <w:p>
+      <w:pPr>
+        <w:pStyle w:val="Compact"/>
+        <w:numPr>
+          <w:ilvl w:val="1"/>
+          <w:numId w:val="1003"/>
+        </w:numPr>
+      </w:pPr>
+      <w:r>
+        <w:rPr>
+          <w:b/>
+          <w:bCs/>
+        </w:rPr>
+        <w:t xml:space="preserve">Пароль</w:t>
+      </w:r>
+      <w:r>
+        <w:t xml:space="preserve"> </w:t>
+      </w:r>
+      <w:r>
+        <w:t xml:space="preserve">— не короче 8 символов;</w:t>
+      </w:r>
+    </w:p>
+    <w:p>
+      <w:pPr>
+        <w:pStyle w:val="Compact"/>
+        <w:numPr>
+          <w:ilvl w:val="1"/>
+          <w:numId w:val="1003"/>
+        </w:numPr>
+      </w:pPr>
+      <w:r>
+        <w:rPr>
+          <w:b/>
+          <w:bCs/>
+        </w:rPr>
+        <w:t xml:space="preserve">Роли</w:t>
+      </w:r>
+      <w:r>
+        <w:t xml:space="preserve"> </w:t>
+      </w:r>
+      <w:r>
+        <w:t xml:space="preserve">— отметьте</w:t>
+      </w:r>
+      <w:r>
+        <w:t xml:space="preserve"> </w:t>
+      </w:r>
+      <w:r>
+        <w:rPr>
+          <w:rStyle w:val="VerbatimChar"/>
+        </w:rPr>
+        <w:t xml:space="preserve">manager</w:t>
+      </w:r>
+      <w:r>
+        <w:t xml:space="preserve"> </w:t>
+      </w:r>
+      <w:r>
+        <w:t xml:space="preserve">(можно несколько ролей сразу).</w:t>
+      </w:r>
+    </w:p>
+    <w:p>
+      <w:pPr>
+        <w:pStyle w:val="Compact"/>
+        <w:numPr>
+          <w:ilvl w:val="0"/>
+          <w:numId w:val="1002"/>
+        </w:numPr>
+      </w:pPr>
+      <w:r>
+        <w:t xml:space="preserve">Нажмите</w:t>
+      </w:r>
+      <w:r>
+        <w:t xml:space="preserve"> </w:t>
+      </w:r>
+      <w:r>
+        <w:rPr>
+          <w:b/>
+          <w:bCs/>
+        </w:rPr>
+        <w:t xml:space="preserve">Создать</w:t>
+      </w:r>
+      <w:r>
+        <w:t xml:space="preserve">.</w:t>
+      </w:r>
+    </w:p>
+    <w:p>
+      <w:pPr>
+        <w:pStyle w:val="Compact"/>
+        <w:numPr>
+          <w:ilvl w:val="0"/>
+          <w:numId w:val="1002"/>
+        </w:numPr>
+      </w:pPr>
+      <w:r>
+        <w:t xml:space="preserve">Передайте сотруднику email и пароль; он входит через</w:t>
+      </w:r>
+      <w:r>
+        <w:t xml:space="preserve"> </w:t>
+      </w:r>
+      <w:r>
+        <w:rPr>
+          <w:rStyle w:val="VerbatimChar"/>
+        </w:rPr>
+        <w:t xml:space="preserve">/login</w:t>
+      </w:r>
+      <w:r>
+        <w:t xml:space="preserve">.</w:t>
+      </w:r>
+    </w:p>
+    <w:p>
+      <w:pPr>
+        <w:pStyle w:val="FirstParagraph"/>
+      </w:pPr>
+      <w:r>
+        <w:t xml:space="preserve">Типичный сценарий: один</w:t>
+      </w:r>
+      <w:r>
+        <w:t xml:space="preserve"> </w:t>
+      </w:r>
+      <w:r>
+        <w:rPr>
+          <w:rStyle w:val="VerbatimChar"/>
+        </w:rPr>
+        <w:t xml:space="preserve">admin</w:t>
+      </w:r>
+      <w:r>
+        <w:t xml:space="preserve"> </w:t>
+      </w:r>
+      <w:r>
+        <w:t xml:space="preserve">(вы) + несколько</w:t>
+      </w:r>
+      <w:r>
+        <w:t xml:space="preserve"> </w:t>
+      </w:r>
+      <w:r>
+        <w:rPr>
+          <w:rStyle w:val="VerbatimChar"/>
+        </w:rPr>
+        <w:t xml:space="preserve">manager</w:t>
+      </w:r>
+      <w:r>
+        <w:t xml:space="preserve"> </w:t>
+      </w:r>
+      <w:r>
+        <w:t xml:space="preserve">для продаж.</w:t>
+      </w:r>
+    </w:p>
+    <w:bookmarkEnd w:id="10"/>
+    <w:bookmarkStart w:id="11" w:name="выдать-или-сменить-роль"/>
+    <w:p>
+      <w:pPr>
+        <w:pStyle w:val="Heading3"/>
+      </w:pPr>
+      <w:r>
+        <w:t xml:space="preserve">Выдать или сменить роль</w:t>
+      </w:r>
+    </w:p>
+    <w:p>
+      <w:pPr>
+        <w:pStyle w:val="Compact"/>
+        <w:numPr>
+          <w:ilvl w:val="0"/>
+          <w:numId w:val="1004"/>
+        </w:numPr>
+      </w:pPr>
+      <w:r>
+        <w:t xml:space="preserve">В списке пользователей найдите нужного человека.</w:t>
+      </w:r>
+    </w:p>
+    <w:p>
+      <w:pPr>
+        <w:pStyle w:val="Compact"/>
+        <w:numPr>
+          <w:ilvl w:val="0"/>
+          <w:numId w:val="1004"/>
+        </w:numPr>
+      </w:pPr>
+      <w:r>
+        <w:t xml:space="preserve">Отметьте/снимите чекбоксы ролей (</w:t>
+      </w:r>
+      <w:r>
+        <w:rPr>
+          <w:rStyle w:val="VerbatimChar"/>
+        </w:rPr>
+        <w:t xml:space="preserve">admin</w:t>
+      </w:r>
+      <w:r>
+        <w:t xml:space="preserve">,</w:t>
+      </w:r>
+      <w:r>
+        <w:t xml:space="preserve"> </w:t>
+      </w:r>
+      <w:r>
+        <w:rPr>
+          <w:rStyle w:val="VerbatimChar"/>
+        </w:rPr>
+        <w:t xml:space="preserve">manager</w:t>
+      </w:r>
+      <w:r>
+        <w:t xml:space="preserve">,</w:t>
+      </w:r>
+      <w:r>
+        <w:t xml:space="preserve"> </w:t>
+      </w:r>
+      <w:r>
+        <w:rPr>
+          <w:rStyle w:val="VerbatimChar"/>
+        </w:rPr>
+        <w:t xml:space="preserve">analyst</w:t>
+      </w:r>
+      <w:r>
+        <w:t xml:space="preserve">).</w:t>
+      </w:r>
+    </w:p>
+    <w:p>
+      <w:pPr>
+        <w:pStyle w:val="Compact"/>
+        <w:numPr>
+          <w:ilvl w:val="0"/>
+          <w:numId w:val="1004"/>
+        </w:numPr>
+      </w:pPr>
+      <w:r>
+        <w:t xml:space="preserve">Нажмите</w:t>
+      </w:r>
+      <w:r>
+        <w:t xml:space="preserve"> </w:t>
+      </w:r>
+      <w:r>
+        <w:rPr>
+          <w:b/>
+          <w:bCs/>
+        </w:rPr>
+        <w:t xml:space="preserve">Сохранить роли</w:t>
+      </w:r>
+      <w:r>
+        <w:t xml:space="preserve">.</w:t>
+      </w:r>
+    </w:p>
+    <w:p>
+      <w:pPr>
+        <w:pStyle w:val="FirstParagraph"/>
+      </w:pPr>
+      <w:r>
+        <w:t xml:space="preserve">Права применяются при следующем запросе/обновлении сессии (после перелогина права точно совпадут с ролями).</w:t>
       </w:r>
     </w:p>
     <w:tbl>
@@ -490,8 +923,8 @@
         <w:tblLook w:firstRow="1" w:lastRow="0" w:firstColumn="0" w:lastColumn="0" w:noHBand="0" w:noVBand="0" w:val="0020"/>
       </w:tblPr>
       <w:tblGrid>
-        <w:gridCol w:w="5280"/>
-        <w:gridCol w:w="2640"/>
+        <w:gridCol w:w="2795"/>
+        <w:gridCol w:w="5124"/>
       </w:tblGrid>
       <w:tr>
         <w:trPr>
@@ -504,18 +937,18 @@
               <w:pStyle w:val="Compact"/>
             </w:pPr>
             <w:r>
-              <w:t xml:space="preserve">Действие</w:t>
-            </w:r>
-          </w:p>
-        </w:tc>
-        <w:tc>
-          <w:tcPr/>
-          <w:p>
-            <w:pPr>
-              <w:pStyle w:val="Compact"/>
-            </w:pPr>
-            <w:r>
-              <w:t xml:space="preserve">Как</w:t>
+              <w:t xml:space="preserve">Роль</w:t>
+            </w:r>
+          </w:p>
+        </w:tc>
+        <w:tc>
+          <w:tcPr/>
+          <w:p>
+            <w:pPr>
+              <w:pStyle w:val="Compact"/>
+            </w:pPr>
+            <w:r>
+              <w:t xml:space="preserve">Что может</w:t>
             </w:r>
           </w:p>
         </w:tc>
@@ -528,54 +961,57 @@
               <w:pStyle w:val="Compact"/>
             </w:pPr>
             <w:r>
-              <w:t xml:space="preserve">Создать менеджера</w:t>
-            </w:r>
-          </w:p>
-        </w:tc>
-        <w:tc>
-          <w:tcPr/>
-          <w:p>
-            <w:pPr>
-              <w:pStyle w:val="Compact"/>
-            </w:pPr>
-            <w:r>
-              <w:t xml:space="preserve">форма «Создать пользователя»: email, ФИО, пароль ≥8, роли (часто</w:t>
-            </w:r>
-            <w:r>
-              <w:t xml:space="preserve"> </w:t>
-            </w:r>
+              <w:rPr>
+                <w:rStyle w:val="VerbatimChar"/>
+              </w:rPr>
+              <w:t xml:space="preserve">admin</w:t>
+            </w:r>
+          </w:p>
+        </w:tc>
+        <w:tc>
+          <w:tcPr/>
+          <w:p>
+            <w:pPr>
+              <w:pStyle w:val="Compact"/>
+            </w:pPr>
+            <w:r>
+              <w:t xml:space="preserve">всё + Настройки (</w:t>
+            </w:r>
+            <w:r>
+              <w:rPr>
+                <w:rStyle w:val="VerbatimChar"/>
+              </w:rPr>
+              <w:t xml:space="preserve">admin.manage</w:t>
+            </w:r>
+            <w:r>
+              <w:t xml:space="preserve">): люди, модули, пороги, интеграции</w:t>
+            </w:r>
+          </w:p>
+        </w:tc>
+      </w:tr>
+      <w:tr>
+        <w:tc>
+          <w:tcPr/>
+          <w:p>
+            <w:pPr>
+              <w:pStyle w:val="Compact"/>
+            </w:pPr>
             <w:r>
               <w:rPr>
                 <w:rStyle w:val="VerbatimChar"/>
               </w:rPr>
               <w:t xml:space="preserve">manager</w:t>
             </w:r>
-            <w:r>
-              <w:t xml:space="preserve">)</w:t>
-            </w:r>
-          </w:p>
-        </w:tc>
-      </w:tr>
-      <w:tr>
-        <w:tc>
-          <w:tcPr/>
-          <w:p>
-            <w:pPr>
-              <w:pStyle w:val="Compact"/>
-            </w:pPr>
-            <w:r>
-              <w:t xml:space="preserve">Выдать / сменить роль</w:t>
-            </w:r>
-          </w:p>
-        </w:tc>
-        <w:tc>
-          <w:tcPr/>
-          <w:p>
-            <w:pPr>
-              <w:pStyle w:val="Compact"/>
-            </w:pPr>
-            <w:r>
-              <w:t xml:space="preserve">чекбоксы ролей у пользователя →</w:t>
+          </w:p>
+        </w:tc>
+        <w:tc>
+          <w:tcPr/>
+          <w:p>
+            <w:pPr>
+              <w:pStyle w:val="Compact"/>
+            </w:pPr>
+            <w:r>
+              <w:t xml:space="preserve">CRM (чтение/запись), коммуникации, AI и analytics read —</w:t>
             </w:r>
             <w:r>
               <w:t xml:space="preserve"> </w:t>
@@ -585,7 +1021,13 @@
                 <w:b/>
                 <w:bCs/>
               </w:rPr>
-              <w:t xml:space="preserve">Сохранить роли</w:t>
+              <w:t xml:space="preserve">без</w:t>
+            </w:r>
+            <w:r>
+              <w:t xml:space="preserve"> </w:t>
+            </w:r>
+            <w:r>
+              <w:t xml:space="preserve">админки</w:t>
             </w:r>
           </w:p>
         </w:tc>
@@ -597,88 +1039,245 @@
             <w:pPr>
               <w:pStyle w:val="Compact"/>
             </w:pPr>
-            <w:r>
-              <w:t xml:space="preserve">Отозвать доступ</w:t>
-            </w:r>
-          </w:p>
-        </w:tc>
-        <w:tc>
-          <w:tcPr/>
-          <w:p>
-            <w:pPr>
-              <w:pStyle w:val="Compact"/>
-            </w:pPr>
-            <w:r>
-              <w:rPr>
-                <w:b/>
-                <w:bCs/>
-              </w:rPr>
-              <w:t xml:space="preserve">Отозвать доступ</w:t>
-            </w:r>
-            <w:r>
-              <w:t xml:space="preserve"> </w:t>
-            </w:r>
-            <w:r>
-              <w:t xml:space="preserve">(</w:t>
-            </w:r>
             <w:r>
               <w:rPr>
                 <w:rStyle w:val="VerbatimChar"/>
               </w:rPr>
-              <w:t xml:space="preserve">is_active=false</w:t>
-            </w:r>
-            <w:r>
-              <w:t xml:space="preserve">, сессии сбрасываются)</w:t>
-            </w:r>
-          </w:p>
-        </w:tc>
-      </w:tr>
-      <w:tr>
-        <w:tc>
-          <w:tcPr/>
-          <w:p>
-            <w:pPr>
-              <w:pStyle w:val="Compact"/>
-            </w:pPr>
-            <w:r>
-              <w:t xml:space="preserve">Вернуть доступ</w:t>
-            </w:r>
-          </w:p>
-        </w:tc>
-        <w:tc>
-          <w:tcPr/>
-          <w:p>
-            <w:pPr>
-              <w:pStyle w:val="Compact"/>
-            </w:pPr>
-            <w:r>
-              <w:rPr>
-                <w:b/>
-                <w:bCs/>
-              </w:rPr>
-              <w:t xml:space="preserve">Восстановить доступ</w:t>
+              <w:t xml:space="preserve">analyst</w:t>
+            </w:r>
+          </w:p>
+        </w:tc>
+        <w:tc>
+          <w:tcPr/>
+          <w:p>
+            <w:pPr>
+              <w:pStyle w:val="Compact"/>
+            </w:pPr>
+            <w:r>
+              <w:t xml:space="preserve">чтение CRM и коммуникаций + AI/analytics — без записи CRM и без админки</w:t>
             </w:r>
           </w:p>
         </w:tc>
       </w:tr>
     </w:tbl>
-    <w:p>
-      <w:pPr>
-        <w:pStyle w:val="BodyText"/>
-      </w:pPr>
-      <w:r>
-        <w:t xml:space="preserve">Роли по умолчанию:</w:t>
+    <w:bookmarkEnd w:id="11"/>
+    <w:bookmarkStart w:id="12" w:name="отозвать-доступ"/>
+    <w:p>
+      <w:pPr>
+        <w:pStyle w:val="Heading3"/>
+      </w:pPr>
+      <w:r>
+        <w:t xml:space="preserve">Отозвать доступ</w:t>
+      </w:r>
+    </w:p>
+    <w:p>
+      <w:pPr>
+        <w:pStyle w:val="Compact"/>
+        <w:numPr>
+          <w:ilvl w:val="0"/>
+          <w:numId w:val="1005"/>
+        </w:numPr>
+      </w:pPr>
+      <w:r>
+        <w:t xml:space="preserve">У пользователя нажмите</w:t>
+      </w:r>
+      <w:r>
+        <w:t xml:space="preserve"> </w:t>
+      </w:r>
+      <w:r>
+        <w:rPr>
+          <w:b/>
+          <w:bCs/>
+        </w:rPr>
+        <w:t xml:space="preserve">Отозвать доступ</w:t>
+      </w:r>
+      <w:r>
+        <w:t xml:space="preserve">.</w:t>
+      </w:r>
+    </w:p>
+    <w:p>
+      <w:pPr>
+        <w:pStyle w:val="Compact"/>
+        <w:numPr>
+          <w:ilvl w:val="0"/>
+          <w:numId w:val="1005"/>
+        </w:numPr>
+      </w:pPr>
+      <w:r>
+        <w:t xml:space="preserve">Учётная запись становится неактивной: вход и refresh-сессии блокируются, активные сессии сбрасываются.</w:t>
+      </w:r>
+    </w:p>
+    <w:p>
+      <w:pPr>
+        <w:pStyle w:val="Compact"/>
+        <w:numPr>
+          <w:ilvl w:val="0"/>
+          <w:numId w:val="1005"/>
+        </w:numPr>
+      </w:pPr>
+      <w:r>
+        <w:t xml:space="preserve">Чтобы вернуть:</w:t>
+      </w:r>
+      <w:r>
+        <w:t xml:space="preserve"> </w:t>
+      </w:r>
+      <w:r>
+        <w:rPr>
+          <w:b/>
+          <w:bCs/>
+        </w:rPr>
+        <w:t xml:space="preserve">Восстановить доступ</w:t>
+      </w:r>
+      <w:r>
+        <w:t xml:space="preserve"> </w:t>
+      </w:r>
+      <w:r>
+        <w:t xml:space="preserve">(пароль тот же, пока не смените отдельно через API/админа).</w:t>
+      </w:r>
+    </w:p>
+    <w:bookmarkEnd w:id="12"/>
+    <w:bookmarkStart w:id="13" w:name="ограничения"/>
+    <w:p>
+      <w:pPr>
+        <w:pStyle w:val="Heading3"/>
+      </w:pPr>
+      <w:r>
+        <w:t xml:space="preserve">Ограничения</w:t>
+      </w:r>
+    </w:p>
+    <w:p>
+      <w:pPr>
+        <w:pStyle w:val="Compact"/>
+        <w:numPr>
+          <w:ilvl w:val="0"/>
+          <w:numId w:val="1006"/>
+        </w:numPr>
+      </w:pPr>
+      <w:r>
+        <w:t xml:space="preserve">Нельзя отозвать доступ</w:t>
+      </w:r>
+      <w:r>
+        <w:t xml:space="preserve"> </w:t>
+      </w:r>
+      <w:r>
+        <w:rPr>
+          <w:b/>
+          <w:bCs/>
+        </w:rPr>
+        <w:t xml:space="preserve">у себя</w:t>
+      </w:r>
+      <w:r>
+        <w:t xml:space="preserve">.</w:t>
+      </w:r>
+    </w:p>
+    <w:p>
+      <w:pPr>
+        <w:pStyle w:val="Compact"/>
+        <w:numPr>
+          <w:ilvl w:val="0"/>
+          <w:numId w:val="1006"/>
+        </w:numPr>
+      </w:pPr>
+      <w:r>
+        <w:t xml:space="preserve">Нельзя оставить организацию</w:t>
+      </w:r>
+      <w:r>
+        <w:t xml:space="preserve"> </w:t>
+      </w:r>
+      <w:r>
+        <w:rPr>
+          <w:b/>
+          <w:bCs/>
+        </w:rPr>
+        <w:t xml:space="preserve">без активного</w:t>
+      </w:r>
+      <w:r>
+        <w:t xml:space="preserve"> </w:t>
+      </w:r>
+      <w:r>
+        <w:t xml:space="preserve">пользователя с ролью</w:t>
+      </w:r>
+      <w:r>
+        <w:t xml:space="preserve"> </w:t>
+      </w:r>
+      <w:r>
+        <w:rPr>
+          <w:rStyle w:val="VerbatimChar"/>
+        </w:rPr>
+        <w:t xml:space="preserve">admin</w:t>
+      </w:r>
+      <w:r>
+        <w:t xml:space="preserve">.</w:t>
+      </w:r>
+    </w:p>
+    <w:p>
+      <w:pPr>
+        <w:pStyle w:val="Compact"/>
+        <w:numPr>
+          <w:ilvl w:val="0"/>
+          <w:numId w:val="1006"/>
+        </w:numPr>
+      </w:pPr>
+      <w:r>
+        <w:t xml:space="preserve">Нельзя снять роль</w:t>
+      </w:r>
+      <w:r>
+        <w:t xml:space="preserve"> </w:t>
+      </w:r>
+      <w:r>
+        <w:rPr>
+          <w:rStyle w:val="VerbatimChar"/>
+        </w:rPr>
+        <w:t xml:space="preserve">admin</w:t>
+      </w:r>
+      <w:r>
+        <w:t xml:space="preserve"> </w:t>
+      </w:r>
+      <w:r>
+        <w:t xml:space="preserve">у последнего активного администратора.</w:t>
+      </w:r>
+    </w:p>
+    <w:bookmarkEnd w:id="13"/>
+    <w:bookmarkStart w:id="14" w:name="api-для-автоматизации"/>
+    <w:p>
+      <w:pPr>
+        <w:pStyle w:val="Heading3"/>
+      </w:pPr>
+      <w:r>
+        <w:t xml:space="preserve">API (для автоматизации)</w:t>
+      </w:r>
+    </w:p>
+    <w:p>
+      <w:pPr>
+        <w:pStyle w:val="FirstParagraph"/>
+      </w:pPr>
+      <w:r>
+        <w:t xml:space="preserve">Все эндпоинты требуют</w:t>
+      </w:r>
+      <w:r>
+        <w:t xml:space="preserve"> </w:t>
+      </w:r>
+      <w:r>
+        <w:rPr>
+          <w:rStyle w:val="VerbatimChar"/>
+        </w:rPr>
+        <w:t xml:space="preserve">admin.manage</w:t>
+      </w:r>
+      <w:r>
+        <w:t xml:space="preserve">, scope — своя организация:</w:t>
       </w:r>
     </w:p>
     <w:tbl>
       <w:tblPr>
         <w:tblStyle w:val="Table"/>
-        <w:tblW w:type="auto" w:w="0"/>
+        <w:tblW w:type="pct" w:w="5000"/>
+        <w:tblLayout w:type="fixed"/>
         <w:tblLook w:firstRow="1" w:lastRow="0" w:firstColumn="0" w:lastColumn="0" w:noHBand="0" w:noVBand="0" w:val="0020"/>
       </w:tblPr>
       <w:tblGrid>
-        <w:gridCol w:w="3960"/>
-        <w:gridCol w:w="3960"/>
+        <w:gridCol w:w="2217"/>
+        <w:gridCol w:w="1900"/>
+        <w:gridCol w:w="3801"/>
       </w:tblGrid>
       <w:tr>
         <w:trPr>
@@ -691,7 +1290,18 @@
               <w:pStyle w:val="Compact"/>
             </w:pPr>
             <w:r>
-              <w:t xml:space="preserve">Роль</w:t>
+              <w:t xml:space="preserve">Метод</w:t>
+            </w:r>
+          </w:p>
+        </w:tc>
+        <w:tc>
+          <w:tcPr/>
+          <w:p>
+            <w:pPr>
+              <w:pStyle w:val="Compact"/>
+            </w:pPr>
+            <w:r>
+              <w:t xml:space="preserve">Путь</w:t>
             </w:r>
           </w:p>
         </w:tc>
@@ -718,27 +1328,32 @@
               <w:rPr>
                 <w:rStyle w:val="VerbatimChar"/>
               </w:rPr>
-              <w:t xml:space="preserve">admin</w:t>
-            </w:r>
-          </w:p>
-        </w:tc>
-        <w:tc>
-          <w:tcPr/>
-          <w:p>
-            <w:pPr>
-              <w:pStyle w:val="Compact"/>
-            </w:pPr>
-            <w:r>
-              <w:t xml:space="preserve">всё +</w:t>
-            </w:r>
-            <w:r>
-              <w:t xml:space="preserve"> </w:t>
-            </w:r>
+              <w:t xml:space="preserve">GET</w:t>
+            </w:r>
+          </w:p>
+        </w:tc>
+        <w:tc>
+          <w:tcPr/>
+          <w:p>
+            <w:pPr>
+              <w:pStyle w:val="Compact"/>
+            </w:pPr>
             <w:r>
               <w:rPr>
                 <w:rStyle w:val="VerbatimChar"/>
               </w:rPr>
-              <w:t xml:space="preserve">admin.manage</w:t>
+              <w:t xml:space="preserve">/organizations/me/users</w:t>
+            </w:r>
+          </w:p>
+        </w:tc>
+        <w:tc>
+          <w:tcPr/>
+          <w:p>
+            <w:pPr>
+              <w:pStyle w:val="Compact"/>
+            </w:pPr>
+            <w:r>
+              <w:t xml:space="preserve">список пользователей</w:t>
             </w:r>
           </w:p>
         </w:tc>
@@ -754,23 +1369,10 @@
               <w:rPr>
                 <w:rStyle w:val="VerbatimChar"/>
               </w:rPr>
-              <w:t xml:space="preserve">manager</w:t>
-            </w:r>
-          </w:p>
-        </w:tc>
-        <w:tc>
-          <w:tcPr/>
-          <w:p>
-            <w:pPr>
-              <w:pStyle w:val="Compact"/>
-            </w:pPr>
-            <w:r>
-              <w:t xml:space="preserve">CRM + коммуникации + AI/analytics read (без admin)</w:t>
-            </w:r>
-          </w:p>
-        </w:tc>
-      </w:tr>
-      <w:tr>
+              <w:t xml:space="preserve">POST</w:t>
+            </w:r>
+          </w:p>
+        </w:tc>
         <w:tc>
           <w:tcPr/>
           <w:p>
@@ -781,43 +1383,218 @@
               <w:rPr>
                 <w:rStyle w:val="VerbatimChar"/>
               </w:rPr>
-              <w:t xml:space="preserve">analyst</w:t>
-            </w:r>
-          </w:p>
-        </w:tc>
-        <w:tc>
-          <w:tcPr/>
-          <w:p>
-            <w:pPr>
-              <w:pStyle w:val="Compact"/>
-            </w:pPr>
-            <w:r>
-              <w:t xml:space="preserve">чтение CRM/comms + AI/analytics</w:t>
+              <w:t xml:space="preserve">/organizations/me/users</w:t>
+            </w:r>
+          </w:p>
+        </w:tc>
+        <w:tc>
+          <w:tcPr/>
+          <w:p>
+            <w:pPr>
+              <w:pStyle w:val="Compact"/>
+            </w:pPr>
+            <w:r>
+              <w:t xml:space="preserve">создать (</w:t>
+            </w:r>
+            <w:r>
+              <w:rPr>
+                <w:rStyle w:val="VerbatimChar"/>
+              </w:rPr>
+              <w:t xml:space="preserve">email</w:t>
+            </w:r>
+            <w:r>
+              <w:t xml:space="preserve">,</w:t>
+            </w:r>
+            <w:r>
+              <w:t xml:space="preserve"> </w:t>
+            </w:r>
+            <w:r>
+              <w:rPr>
+                <w:rStyle w:val="VerbatimChar"/>
+              </w:rPr>
+              <w:t xml:space="preserve">full_name</w:t>
+            </w:r>
+            <w:r>
+              <w:t xml:space="preserve">,</w:t>
+            </w:r>
+            <w:r>
+              <w:t xml:space="preserve"> </w:t>
+            </w:r>
+            <w:r>
+              <w:rPr>
+                <w:rStyle w:val="VerbatimChar"/>
+              </w:rPr>
+              <w:t xml:space="preserve">password</w:t>
+            </w:r>
+            <w:r>
+              <w:t xml:space="preserve">,</w:t>
+            </w:r>
+            <w:r>
+              <w:t xml:space="preserve"> </w:t>
+            </w:r>
+            <w:r>
+              <w:rPr>
+                <w:rStyle w:val="VerbatimChar"/>
+              </w:rPr>
+              <w:t xml:space="preserve">roles[]</w:t>
+            </w:r>
+            <w:r>
+              <w:t xml:space="preserve">)</w:t>
+            </w:r>
+          </w:p>
+        </w:tc>
+      </w:tr>
+      <w:tr>
+        <w:tc>
+          <w:tcPr/>
+          <w:p>
+            <w:pPr>
+              <w:pStyle w:val="Compact"/>
+            </w:pPr>
+            <w:r>
+              <w:rPr>
+                <w:rStyle w:val="VerbatimChar"/>
+              </w:rPr>
+              <w:t xml:space="preserve">PATCH</w:t>
+            </w:r>
+          </w:p>
+        </w:tc>
+        <w:tc>
+          <w:tcPr/>
+          <w:p>
+            <w:pPr>
+              <w:pStyle w:val="Compact"/>
+            </w:pPr>
+            <w:r>
+              <w:rPr>
+                <w:rStyle w:val="VerbatimChar"/>
+              </w:rPr>
+              <w:t xml:space="preserve">/organizations/me/users/{id}</w:t>
+            </w:r>
+          </w:p>
+        </w:tc>
+        <w:tc>
+          <w:tcPr/>
+          <w:p>
+            <w:pPr>
+              <w:pStyle w:val="Compact"/>
+            </w:pPr>
+            <w:r>
+              <w:rPr>
+                <w:rStyle w:val="VerbatimChar"/>
+              </w:rPr>
+              <w:t xml:space="preserve">is_active</w:t>
+            </w:r>
+            <w:r>
+              <w:t xml:space="preserve">,</w:t>
+            </w:r>
+            <w:r>
+              <w:t xml:space="preserve"> </w:t>
+            </w:r>
+            <w:r>
+              <w:rPr>
+                <w:rStyle w:val="VerbatimChar"/>
+              </w:rPr>
+              <w:t xml:space="preserve">full_name</w:t>
+            </w:r>
+            <w:r>
+              <w:t xml:space="preserve">,</w:t>
+            </w:r>
+            <w:r>
+              <w:t xml:space="preserve"> </w:t>
+            </w:r>
+            <w:r>
+              <w:rPr>
+                <w:rStyle w:val="VerbatimChar"/>
+              </w:rPr>
+              <w:t xml:space="preserve">password</w:t>
+            </w:r>
+          </w:p>
+        </w:tc>
+      </w:tr>
+      <w:tr>
+        <w:tc>
+          <w:tcPr/>
+          <w:p>
+            <w:pPr>
+              <w:pStyle w:val="Compact"/>
+            </w:pPr>
+            <w:r>
+              <w:rPr>
+                <w:rStyle w:val="VerbatimChar"/>
+              </w:rPr>
+              <w:t xml:space="preserve">PUT</w:t>
+            </w:r>
+          </w:p>
+        </w:tc>
+        <w:tc>
+          <w:tcPr/>
+          <w:p>
+            <w:pPr>
+              <w:pStyle w:val="Compact"/>
+            </w:pPr>
+            <w:r>
+              <w:rPr>
+                <w:rStyle w:val="VerbatimChar"/>
+              </w:rPr>
+              <w:t xml:space="preserve">/organizations/me/users/{id}/roles</w:t>
+            </w:r>
+          </w:p>
+        </w:tc>
+        <w:tc>
+          <w:tcPr/>
+          <w:p>
+            <w:pPr>
+              <w:pStyle w:val="Compact"/>
+            </w:pPr>
+            <w:r>
+              <w:t xml:space="preserve">заменить набор ролей</w:t>
+            </w:r>
+          </w:p>
+        </w:tc>
+      </w:tr>
+      <w:tr>
+        <w:tc>
+          <w:tcPr/>
+          <w:p>
+            <w:pPr>
+              <w:pStyle w:val="Compact"/>
+            </w:pPr>
+            <w:r>
+              <w:rPr>
+                <w:rStyle w:val="VerbatimChar"/>
+              </w:rPr>
+              <w:t xml:space="preserve">GET</w:t>
+            </w:r>
+          </w:p>
+        </w:tc>
+        <w:tc>
+          <w:tcPr/>
+          <w:p>
+            <w:pPr>
+              <w:pStyle w:val="Compact"/>
+            </w:pPr>
+            <w:r>
+              <w:rPr>
+                <w:rStyle w:val="VerbatimChar"/>
+              </w:rPr>
+              <w:t xml:space="preserve">/organizations/me/roles</w:t>
+            </w:r>
+          </w:p>
+        </w:tc>
+        <w:tc>
+          <w:tcPr/>
+          <w:p>
+            <w:pPr>
+              <w:pStyle w:val="Compact"/>
+            </w:pPr>
+            <w:r>
+              <w:t xml:space="preserve">каталог ролей орг</w:t>
             </w:r>
           </w:p>
         </w:tc>
       </w:tr>
     </w:tbl>
-    <w:p>
-      <w:pPr>
-        <w:pStyle w:val="BodyText"/>
-      </w:pPr>
-      <w:r>
-        <w:t xml:space="preserve">Ограничения: нельзя отозвать доступ у себя; нельзя оставить организацию без активного</w:t>
-      </w:r>
-      <w:r>
-        <w:t xml:space="preserve"> </w:t>
-      </w:r>
-      <w:r>
-        <w:rPr>
-          <w:rStyle w:val="VerbatimChar"/>
-        </w:rPr>
-        <w:t xml:space="preserve">admin</w:t>
-      </w:r>
-      <w:r>
-        <w:t xml:space="preserve">.</w:t>
-      </w:r>
-    </w:p>
     <w:p>
       <w:r>
         <w:pict>
@@ -825,8 +1602,9 @@
         </w:pict>
       </w:r>
     </w:p>
-    <w:bookmarkEnd w:id="10"/>
-    <w:bookmarkStart w:id="11" w:name="модули-организации"/>
+    <w:bookmarkEnd w:id="14"/>
+    <w:bookmarkEnd w:id="15"/>
+    <w:bookmarkStart w:id="16" w:name="модули-организации"/>
     <w:p>
       <w:pPr>
         <w:pStyle w:val="Heading2"/>
@@ -1145,7 +1923,7 @@
         <w:pStyle w:val="Compact"/>
         <w:numPr>
           <w:ilvl w:val="0"/>
-          <w:numId w:val="1002"/>
+          <w:numId w:val="1007"/>
         </w:numPr>
       </w:pPr>
       <w:r>
@@ -1157,7 +1935,7 @@
         <w:pStyle w:val="Compact"/>
         <w:numPr>
           <w:ilvl w:val="0"/>
-          <w:numId w:val="1002"/>
+          <w:numId w:val="1007"/>
         </w:numPr>
       </w:pPr>
       <w:r>
@@ -1212,7 +1990,7 @@
         <w:pStyle w:val="Compact"/>
         <w:numPr>
           <w:ilvl w:val="0"/>
-          <w:numId w:val="1002"/>
+          <w:numId w:val="1007"/>
         </w:numPr>
       </w:pPr>
       <w:r>
@@ -1255,8 +2033,8 @@
         </w:pict>
       </w:r>
     </w:p>
-    <w:bookmarkEnd w:id="11"/>
-    <w:bookmarkStart w:id="12" w:name="аналитика-пороги"/>
+    <w:bookmarkEnd w:id="16"/>
+    <w:bookmarkStart w:id="17" w:name="аналитика-пороги"/>
     <w:p>
       <w:pPr>
         <w:pStyle w:val="Heading2"/>
@@ -1301,21 +2079,6 @@
           <w:bCs/>
         </w:rPr>
         <w:t xml:space="preserve">URL:</w:t>
-      </w:r>
-      <w:r>
-        <w:t xml:space="preserve"> </w:t>
-      </w:r>
-      <w:r>
-        <w:rPr>
-          <w:rStyle w:val="VerbatimChar"/>
-        </w:rPr>
-        <w:t xml:space="preserve">/settings</w:t>
-      </w:r>
-      <w:r>
-        <w:t xml:space="preserve"> </w:t>
-      </w:r>
-      <w:r>
-        <w:t xml:space="preserve">или</w:t>
       </w:r>
       <w:r>
         <w:t xml:space="preserve"> </w:t>
@@ -1499,7 +2262,7 @@
         <w:pStyle w:val="Compact"/>
         <w:numPr>
           <w:ilvl w:val="0"/>
-          <w:numId w:val="1003"/>
+          <w:numId w:val="1008"/>
         </w:numPr>
       </w:pPr>
       <w:r>
@@ -1514,7 +2277,7 @@
         <w:pStyle w:val="Compact"/>
         <w:numPr>
           <w:ilvl w:val="0"/>
-          <w:numId w:val="1003"/>
+          <w:numId w:val="1008"/>
         </w:numPr>
       </w:pPr>
       <w:r>
@@ -1528,8 +2291,8 @@
         </w:pict>
       </w:r>
     </w:p>
-    <w:bookmarkEnd w:id="12"/>
-    <w:bookmarkStart w:id="13" w:name="интеграции-обзор"/>
+    <w:bookmarkEnd w:id="17"/>
+    <w:bookmarkStart w:id="18" w:name="интеграции-обзор"/>
     <w:p>
       <w:pPr>
         <w:pStyle w:val="Heading2"/>
@@ -1810,8 +2573,8 @@
         </w:pict>
       </w:r>
     </w:p>
-    <w:bookmarkEnd w:id="13"/>
-    <w:bookmarkStart w:id="24" w:name="telegram"/>
+    <w:bookmarkEnd w:id="18"/>
+    <w:bookmarkStart w:id="29" w:name="telegram"/>
     <w:p>
       <w:pPr>
         <w:pStyle w:val="Heading2"/>
@@ -1820,7 +2583,7 @@
         <w:t xml:space="preserve">5. Telegram</w:t>
       </w:r>
     </w:p>
-    <w:bookmarkStart w:id="14" w:name="что-умеет"/>
+    <w:bookmarkStart w:id="19" w:name="что-умеет"/>
     <w:p>
       <w:pPr>
         <w:pStyle w:val="Heading3"/>
@@ -1834,7 +2597,7 @@
         <w:pStyle w:val="Compact"/>
         <w:numPr>
           <w:ilvl w:val="0"/>
-          <w:numId w:val="1004"/>
+          <w:numId w:val="1009"/>
         </w:numPr>
       </w:pPr>
       <w:r>
@@ -1855,7 +2618,7 @@
         <w:pStyle w:val="Compact"/>
         <w:numPr>
           <w:ilvl w:val="0"/>
-          <w:numId w:val="1004"/>
+          <w:numId w:val="1009"/>
         </w:numPr>
       </w:pPr>
       <w:r>
@@ -1877,7 +2640,7 @@
         <w:pStyle w:val="Compact"/>
         <w:numPr>
           <w:ilvl w:val="0"/>
-          <w:numId w:val="1004"/>
+          <w:numId w:val="1009"/>
         </w:numPr>
       </w:pPr>
       <w:r>
@@ -1889,7 +2652,7 @@
         <w:pStyle w:val="Compact"/>
         <w:numPr>
           <w:ilvl w:val="0"/>
-          <w:numId w:val="1004"/>
+          <w:numId w:val="1009"/>
         </w:numPr>
       </w:pPr>
       <w:r>
@@ -1936,8 +2699,8 @@
         <w:t xml:space="preserve">— только poll.</w:t>
       </w:r>
     </w:p>
-    <w:bookmarkEnd w:id="14"/>
-    <w:bookmarkStart w:id="16" w:name="создание-бота-веб"/>
+    <w:bookmarkEnd w:id="19"/>
+    <w:bookmarkStart w:id="21" w:name="создание-бота-веб"/>
     <w:p>
       <w:pPr>
         <w:pStyle w:val="Heading3"/>
@@ -1951,7 +2714,7 @@
         <w:pStyle w:val="Compact"/>
         <w:numPr>
           <w:ilvl w:val="0"/>
-          <w:numId w:val="1005"/>
+          <w:numId w:val="1010"/>
         </w:numPr>
       </w:pPr>
       <w:r>
@@ -1960,7 +2723,7 @@
       <w:r>
         <w:t xml:space="preserve"> </w:t>
       </w:r>
-      <w:hyperlink r:id="rId15">
+      <w:hyperlink r:id="rId20">
         <w:r>
           <w:rPr>
             <w:rStyle w:val="Hyperlink"/>
@@ -1983,7 +2746,7 @@
         <w:pStyle w:val="Compact"/>
         <w:numPr>
           <w:ilvl w:val="0"/>
-          <w:numId w:val="1005"/>
+          <w:numId w:val="1010"/>
         </w:numPr>
       </w:pPr>
       <w:r>
@@ -2013,7 +2776,7 @@
         <w:pStyle w:val="Compact"/>
         <w:numPr>
           <w:ilvl w:val="0"/>
-          <w:numId w:val="1005"/>
+          <w:numId w:val="1010"/>
         </w:numPr>
       </w:pPr>
       <w:r>
@@ -2056,7 +2819,7 @@
         <w:pStyle w:val="Compact"/>
         <w:numPr>
           <w:ilvl w:val="0"/>
-          <w:numId w:val="1005"/>
+          <w:numId w:val="1010"/>
         </w:numPr>
       </w:pPr>
       <w:r>
@@ -2071,7 +2834,7 @@
         <w:pStyle w:val="Compact"/>
         <w:numPr>
           <w:ilvl w:val="0"/>
-          <w:numId w:val="1005"/>
+          <w:numId w:val="1010"/>
         </w:numPr>
       </w:pPr>
       <w:r>
@@ -2097,8 +2860,8 @@
         <w:t xml:space="preserve">https://api.telegram.org/bot&lt;TOKEN&gt;/getMe</w:t>
       </w:r>
     </w:p>
-    <w:bookmarkEnd w:id="16"/>
-    <w:bookmarkStart w:id="17" w:name="env-на-сервере-обязательно"/>
+    <w:bookmarkEnd w:id="21"/>
+    <w:bookmarkStart w:id="22" w:name="env-на-сервере-обязательно"/>
     <w:p>
       <w:pPr>
         <w:pStyle w:val="Heading3"/>
@@ -2323,8 +3086,8 @@
         <w:t xml:space="preserve">.</w:t>
       </w:r>
     </w:p>
-    <w:bookmarkEnd w:id="17"/>
-    <w:bookmarkStart w:id="18" w:name="режимы-статуса"/>
+    <w:bookmarkEnd w:id="22"/>
+    <w:bookmarkStart w:id="23" w:name="режимы-статуса"/>
     <w:p>
       <w:pPr>
         <w:pStyle w:val="Heading3"/>
@@ -2473,8 +3236,8 @@
         </w:tc>
       </w:tr>
     </w:tbl>
-    <w:bookmarkEnd w:id="18"/>
-    <w:bookmarkStart w:id="21" w:name="привязка-контакта"/>
+    <w:bookmarkEnd w:id="23"/>
+    <w:bookmarkStart w:id="26" w:name="привязка-контакта"/>
     <w:p>
       <w:pPr>
         <w:pStyle w:val="Heading3"/>
@@ -2488,7 +3251,7 @@
         <w:pStyle w:val="Compact"/>
         <w:numPr>
           <w:ilvl w:val="0"/>
-          <w:numId w:val="1006"/>
+          <w:numId w:val="1011"/>
         </w:numPr>
       </w:pPr>
       <w:r>
@@ -2503,7 +3266,7 @@
         <w:pStyle w:val="Compact"/>
         <w:numPr>
           <w:ilvl w:val="0"/>
-          <w:numId w:val="1006"/>
+          <w:numId w:val="1011"/>
         </w:numPr>
       </w:pPr>
       <w:r>
@@ -2543,7 +3306,7 @@
         <w:pStyle w:val="Compact"/>
         <w:numPr>
           <w:ilvl w:val="0"/>
-          <w:numId w:val="1006"/>
+          <w:numId w:val="1011"/>
         </w:numPr>
       </w:pPr>
       <w:r>
@@ -2563,7 +3326,7 @@
         <w:pStyle w:val="Compact"/>
         <w:numPr>
           <w:ilvl w:val="0"/>
-          <w:numId w:val="1007"/>
+          <w:numId w:val="1012"/>
         </w:numPr>
       </w:pPr>
       <w:r>
@@ -2578,7 +3341,7 @@
         <w:pStyle w:val="Compact"/>
         <w:numPr>
           <w:ilvl w:val="0"/>
-          <w:numId w:val="1007"/>
+          <w:numId w:val="1012"/>
         </w:numPr>
       </w:pPr>
       <w:r>
@@ -2601,7 +3364,7 @@
         <w:pStyle w:val="Compact"/>
         <w:numPr>
           <w:ilvl w:val="0"/>
-          <w:numId w:val="1008"/>
+          <w:numId w:val="1013"/>
         </w:numPr>
       </w:pPr>
       <w:r>
@@ -2631,7 +3394,7 @@
         <w:pStyle w:val="Compact"/>
         <w:numPr>
           <w:ilvl w:val="0"/>
-          <w:numId w:val="1008"/>
+          <w:numId w:val="1013"/>
         </w:numPr>
       </w:pPr>
       <w:r>
@@ -2663,7 +3426,7 @@
       <w:r>
         <w:t xml:space="preserve"> </w:t>
       </w:r>
-      <w:hyperlink r:id="rId19">
+      <w:hyperlink r:id="rId24">
         <w:r>
           <w:rPr>
             <w:rStyle w:val="Hyperlink"/>
@@ -2677,7 +3440,7 @@
       <w:r>
         <w:t xml:space="preserve"> </w:t>
       </w:r>
-      <w:hyperlink r:id="rId20">
+      <w:hyperlink r:id="rId25">
         <w:r>
           <w:rPr>
             <w:rStyle w:val="Hyperlink"/>
@@ -2689,8 +3452,8 @@
         <w:t xml:space="preserve">.</w:t>
       </w:r>
     </w:p>
-    <w:bookmarkEnd w:id="21"/>
-    <w:bookmarkStart w:id="22" w:name="опрос-сообщений"/>
+    <w:bookmarkEnd w:id="26"/>
+    <w:bookmarkStart w:id="27" w:name="опрос-сообщений"/>
     <w:p>
       <w:pPr>
         <w:pStyle w:val="Heading3"/>
@@ -2704,7 +3467,7 @@
         <w:pStyle w:val="Compact"/>
         <w:numPr>
           <w:ilvl w:val="0"/>
-          <w:numId w:val="1009"/>
+          <w:numId w:val="1014"/>
         </w:numPr>
       </w:pPr>
       <w:r>
@@ -2735,7 +3498,7 @@
         <w:pStyle w:val="Compact"/>
         <w:numPr>
           <w:ilvl w:val="0"/>
-          <w:numId w:val="1009"/>
+          <w:numId w:val="1014"/>
         </w:numPr>
       </w:pPr>
       <w:r>
@@ -2765,7 +3528,7 @@
         <w:pStyle w:val="Compact"/>
         <w:numPr>
           <w:ilvl w:val="0"/>
-          <w:numId w:val="1009"/>
+          <w:numId w:val="1014"/>
         </w:numPr>
       </w:pPr>
       <w:r>
@@ -2793,7 +3556,7 @@
         <w:pStyle w:val="Compact"/>
         <w:numPr>
           <w:ilvl w:val="0"/>
-          <w:numId w:val="1009"/>
+          <w:numId w:val="1014"/>
         </w:numPr>
       </w:pPr>
       <w:r>
@@ -2846,8 +3609,8 @@
         <w:t xml:space="preserve">будет отклонён.</w:t>
       </w:r>
     </w:p>
-    <w:bookmarkEnd w:id="22"/>
-    <w:bookmarkStart w:id="23" w:name="чеклист-telegram"/>
+    <w:bookmarkEnd w:id="27"/>
+    <w:bookmarkStart w:id="28" w:name="чеклист-telegram"/>
     <w:p>
       <w:pPr>
         <w:pStyle w:val="Heading3"/>
@@ -2861,7 +3624,7 @@
         <w:pStyle w:val="Compact"/>
         <w:numPr>
           <w:ilvl w:val="0"/>
-          <w:numId w:val="1010"/>
+          <w:numId w:val="1015"/>
         </w:numPr>
       </w:pPr>
       <w:r>
@@ -2876,7 +3639,7 @@
         <w:pStyle w:val="Compact"/>
         <w:numPr>
           <w:ilvl w:val="0"/>
-          <w:numId w:val="1011"/>
+          <w:numId w:val="1016"/>
         </w:numPr>
       </w:pPr>
       <w:r>
@@ -2924,7 +3687,7 @@
         <w:pStyle w:val="Compact"/>
         <w:numPr>
           <w:ilvl w:val="0"/>
-          <w:numId w:val="1012"/>
+          <w:numId w:val="1017"/>
         </w:numPr>
       </w:pPr>
       <w:r>
@@ -2939,7 +3702,7 @@
         <w:pStyle w:val="Compact"/>
         <w:numPr>
           <w:ilvl w:val="0"/>
-          <w:numId w:val="1013"/>
+          <w:numId w:val="1018"/>
         </w:numPr>
       </w:pPr>
       <w:r>
@@ -2954,7 +3717,7 @@
         <w:pStyle w:val="Compact"/>
         <w:numPr>
           <w:ilvl w:val="0"/>
-          <w:numId w:val="1014"/>
+          <w:numId w:val="1019"/>
         </w:numPr>
       </w:pPr>
       <w:r>
@@ -2969,7 +3732,7 @@
         <w:pStyle w:val="Compact"/>
         <w:numPr>
           <w:ilvl w:val="0"/>
-          <w:numId w:val="1015"/>
+          <w:numId w:val="1020"/>
         </w:numPr>
       </w:pPr>
       <w:r>
@@ -2984,7 +3747,7 @@
         <w:pStyle w:val="Compact"/>
         <w:numPr>
           <w:ilvl w:val="0"/>
-          <w:numId w:val="1016"/>
+          <w:numId w:val="1021"/>
         </w:numPr>
       </w:pPr>
       <w:r>
@@ -2998,9 +3761,9 @@
         </w:pict>
       </w:r>
     </w:p>
-    <w:bookmarkEnd w:id="23"/>
-    <w:bookmarkEnd w:id="24"/>
-    <w:bookmarkStart w:id="30" w:name="openai-модуль-ии"/>
+    <w:bookmarkEnd w:id="28"/>
+    <w:bookmarkEnd w:id="29"/>
+    <w:bookmarkStart w:id="35" w:name="openai-модуль-ии"/>
     <w:p>
       <w:pPr>
         <w:pStyle w:val="Heading2"/>
@@ -3009,7 +3772,7 @@
         <w:t xml:space="preserve">6. OpenAI (модуль ИИ)</w:t>
       </w:r>
     </w:p>
-    <w:bookmarkStart w:id="25" w:name="что-умеет-1"/>
+    <w:bookmarkStart w:id="30" w:name="что-умеет-1"/>
     <w:p>
       <w:pPr>
         <w:pStyle w:val="Heading3"/>
@@ -3023,7 +3786,7 @@
         <w:pStyle w:val="Compact"/>
         <w:numPr>
           <w:ilvl w:val="0"/>
-          <w:numId w:val="1017"/>
+          <w:numId w:val="1022"/>
         </w:numPr>
       </w:pPr>
       <w:r>
@@ -3038,7 +3801,7 @@
         <w:pStyle w:val="Compact"/>
         <w:numPr>
           <w:ilvl w:val="0"/>
-          <w:numId w:val="1017"/>
+          <w:numId w:val="1022"/>
         </w:numPr>
       </w:pPr>
       <w:r>
@@ -3065,15 +3828,15 @@
         <w:pStyle w:val="Compact"/>
         <w:numPr>
           <w:ilvl w:val="0"/>
-          <w:numId w:val="1017"/>
+          <w:numId w:val="1022"/>
         </w:numPr>
       </w:pPr>
       <w:r>
         <w:t xml:space="preserve">Режимы: mock / live / degraded</w:t>
       </w:r>
     </w:p>
-    <w:bookmarkEnd w:id="25"/>
-    <w:bookmarkStart w:id="26" w:name="получение-ключа-веб"/>
+    <w:bookmarkEnd w:id="30"/>
+    <w:bookmarkStart w:id="31" w:name="получение-ключа-веб"/>
     <w:p>
       <w:pPr>
         <w:pStyle w:val="Heading3"/>
@@ -3087,7 +3850,7 @@
         <w:pStyle w:val="Compact"/>
         <w:numPr>
           <w:ilvl w:val="0"/>
-          <w:numId w:val="1018"/>
+          <w:numId w:val="1023"/>
         </w:numPr>
       </w:pPr>
       <w:r>
@@ -3102,7 +3865,7 @@
         <w:pStyle w:val="Compact"/>
         <w:numPr>
           <w:ilvl w:val="0"/>
-          <w:numId w:val="1018"/>
+          <w:numId w:val="1023"/>
         </w:numPr>
       </w:pPr>
       <w:r>
@@ -3117,7 +3880,7 @@
         <w:pStyle w:val="Compact"/>
         <w:numPr>
           <w:ilvl w:val="0"/>
-          <w:numId w:val="1018"/>
+          <w:numId w:val="1023"/>
         </w:numPr>
       </w:pPr>
       <w:r>
@@ -3141,7 +3904,7 @@
         <w:pStyle w:val="Compact"/>
         <w:numPr>
           <w:ilvl w:val="0"/>
-          <w:numId w:val="1018"/>
+          <w:numId w:val="1023"/>
         </w:numPr>
       </w:pPr>
       <w:r>
@@ -3156,15 +3919,15 @@
         <w:pStyle w:val="Compact"/>
         <w:numPr>
           <w:ilvl w:val="0"/>
-          <w:numId w:val="1018"/>
+          <w:numId w:val="1023"/>
         </w:numPr>
       </w:pPr>
       <w:r>
         <w:t xml:space="preserve">Модели: https://platform.openai.com/docs/models</w:t>
       </w:r>
     </w:p>
-    <w:bookmarkEnd w:id="26"/>
-    <w:bookmarkStart w:id="27" w:name="env-на-сервере"/>
+    <w:bookmarkEnd w:id="31"/>
+    <w:bookmarkStart w:id="32" w:name="env-на-сервере"/>
     <w:p>
       <w:pPr>
         <w:pStyle w:val="Heading3"/>
@@ -3425,8 +4188,8 @@
         <w:t xml:space="preserve">.</w:t>
       </w:r>
     </w:p>
-    <w:bookmarkEnd w:id="27"/>
-    <w:bookmarkStart w:id="28" w:name="включение-в-ui"/>
+    <w:bookmarkEnd w:id="32"/>
+    <w:bookmarkStart w:id="33" w:name="включение-в-ui"/>
     <w:p>
       <w:pPr>
         <w:pStyle w:val="Heading3"/>
@@ -3440,7 +4203,7 @@
         <w:pStyle w:val="Compact"/>
         <w:numPr>
           <w:ilvl w:val="0"/>
-          <w:numId w:val="1019"/>
+          <w:numId w:val="1024"/>
         </w:numPr>
       </w:pPr>
       <w:r>
@@ -3471,7 +4234,7 @@
         <w:pStyle w:val="Compact"/>
         <w:numPr>
           <w:ilvl w:val="0"/>
-          <w:numId w:val="1019"/>
+          <w:numId w:val="1024"/>
         </w:numPr>
       </w:pPr>
       <w:r>
@@ -3499,7 +4262,7 @@
         <w:pStyle w:val="Compact"/>
         <w:numPr>
           <w:ilvl w:val="0"/>
-          <w:numId w:val="1019"/>
+          <w:numId w:val="1024"/>
         </w:numPr>
       </w:pPr>
       <w:r>
@@ -3514,7 +4277,7 @@
         <w:pStyle w:val="Compact"/>
         <w:numPr>
           <w:ilvl w:val="0"/>
-          <w:numId w:val="1019"/>
+          <w:numId w:val="1024"/>
         </w:numPr>
       </w:pPr>
       <w:r>
@@ -3592,8 +4355,8 @@
         <w:t xml:space="preserve">= ошибка API → fallback.</w:t>
       </w:r>
     </w:p>
-    <w:bookmarkEnd w:id="28"/>
-    <w:bookmarkStart w:id="29" w:name="чеклист-ии"/>
+    <w:bookmarkEnd w:id="33"/>
+    <w:bookmarkStart w:id="34" w:name="чеклист-ии"/>
     <w:p>
       <w:pPr>
         <w:pStyle w:val="Heading3"/>
@@ -3607,7 +4370,7 @@
         <w:pStyle w:val="Compact"/>
         <w:numPr>
           <w:ilvl w:val="0"/>
-          <w:numId w:val="1020"/>
+          <w:numId w:val="1025"/>
         </w:numPr>
       </w:pPr>
       <w:r>
@@ -3622,7 +4385,7 @@
         <w:pStyle w:val="Compact"/>
         <w:numPr>
           <w:ilvl w:val="0"/>
-          <w:numId w:val="1021"/>
+          <w:numId w:val="1026"/>
         </w:numPr>
       </w:pPr>
       <w:r>
@@ -3670,7 +4433,7 @@
         <w:pStyle w:val="Compact"/>
         <w:numPr>
           <w:ilvl w:val="0"/>
-          <w:numId w:val="1022"/>
+          <w:numId w:val="1027"/>
         </w:numPr>
       </w:pPr>
       <w:r>
@@ -3694,7 +4457,7 @@
         <w:pStyle w:val="Compact"/>
         <w:numPr>
           <w:ilvl w:val="0"/>
-          <w:numId w:val="1023"/>
+          <w:numId w:val="1028"/>
         </w:numPr>
       </w:pPr>
       <w:r>
@@ -3709,7 +4472,7 @@
         <w:pStyle w:val="Compact"/>
         <w:numPr>
           <w:ilvl w:val="0"/>
-          <w:numId w:val="1024"/>
+          <w:numId w:val="1029"/>
         </w:numPr>
       </w:pPr>
       <w:r>
@@ -3723,9 +4486,9 @@
         </w:pict>
       </w:r>
     </w:p>
-    <w:bookmarkEnd w:id="29"/>
-    <w:bookmarkEnd w:id="30"/>
-    <w:bookmarkStart w:id="33" w:name="gmail-stub"/>
+    <w:bookmarkEnd w:id="34"/>
+    <w:bookmarkEnd w:id="35"/>
+    <w:bookmarkStart w:id="38" w:name="gmail-stub"/>
     <w:p>
       <w:pPr>
         <w:pStyle w:val="Heading2"/>
@@ -3734,7 +4497,7 @@
         <w:t xml:space="preserve">7. Gmail (stub)</w:t>
       </w:r>
     </w:p>
-    <w:bookmarkStart w:id="31" w:name="текущее-состояние"/>
+    <w:bookmarkStart w:id="36" w:name="текущее-состояние"/>
     <w:p>
       <w:pPr>
         <w:pStyle w:val="Heading3"/>
@@ -3769,7 +4532,7 @@
         <w:pStyle w:val="Compact"/>
         <w:numPr>
           <w:ilvl w:val="0"/>
-          <w:numId w:val="1025"/>
+          <w:numId w:val="1030"/>
         </w:numPr>
       </w:pPr>
       <w:r>
@@ -3784,7 +4547,7 @@
         <w:pStyle w:val="Compact"/>
         <w:numPr>
           <w:ilvl w:val="0"/>
-          <w:numId w:val="1025"/>
+          <w:numId w:val="1030"/>
         </w:numPr>
       </w:pPr>
       <w:r>
@@ -3814,7 +4577,7 @@
         <w:pStyle w:val="Compact"/>
         <w:numPr>
           <w:ilvl w:val="0"/>
-          <w:numId w:val="1025"/>
+          <w:numId w:val="1030"/>
         </w:numPr>
       </w:pPr>
       <w:r>
@@ -3837,8 +4600,8 @@
         <w:t xml:space="preserve">(ручная запись в timeline)</w:t>
       </w:r>
     </w:p>
-    <w:bookmarkEnd w:id="31"/>
-    <w:bookmarkStart w:id="32" w:name="что-понадобится-для-live-перспектива"/>
+    <w:bookmarkEnd w:id="36"/>
+    <w:bookmarkStart w:id="37" w:name="что-понадобится-для-live-перспектива"/>
     <w:p>
       <w:pPr>
         <w:pStyle w:val="Heading3"/>
@@ -3860,7 +4623,7 @@
         <w:pStyle w:val="Compact"/>
         <w:numPr>
           <w:ilvl w:val="0"/>
-          <w:numId w:val="1026"/>
+          <w:numId w:val="1031"/>
         </w:numPr>
       </w:pPr>
       <w:r>
@@ -3875,7 +4638,7 @@
         <w:pStyle w:val="Compact"/>
         <w:numPr>
           <w:ilvl w:val="0"/>
-          <w:numId w:val="1026"/>
+          <w:numId w:val="1031"/>
         </w:numPr>
       </w:pPr>
       <w:r>
@@ -3909,7 +4672,7 @@
         <w:pStyle w:val="Compact"/>
         <w:numPr>
           <w:ilvl w:val="0"/>
-          <w:numId w:val="1026"/>
+          <w:numId w:val="1031"/>
         </w:numPr>
       </w:pPr>
       <w:r>
@@ -3930,7 +4693,7 @@
         <w:pStyle w:val="Compact"/>
         <w:numPr>
           <w:ilvl w:val="0"/>
-          <w:numId w:val="1026"/>
+          <w:numId w:val="1031"/>
         </w:numPr>
       </w:pPr>
       <w:r>
@@ -3951,7 +4714,7 @@
         <w:pStyle w:val="Compact"/>
         <w:numPr>
           <w:ilvl w:val="0"/>
-          <w:numId w:val="1026"/>
+          <w:numId w:val="1031"/>
         </w:numPr>
       </w:pPr>
       <w:r>
@@ -3966,7 +4729,7 @@
         <w:pStyle w:val="Compact"/>
         <w:numPr>
           <w:ilvl w:val="0"/>
-          <w:numId w:val="1026"/>
+          <w:numId w:val="1031"/>
         </w:numPr>
       </w:pPr>
       <w:r>
@@ -3988,9 +4751,9 @@
         </w:pict>
       </w:r>
     </w:p>
-    <w:bookmarkEnd w:id="32"/>
-    <w:bookmarkEnd w:id="33"/>
-    <w:bookmarkStart w:id="36" w:name="календарь-stub"/>
+    <w:bookmarkEnd w:id="37"/>
+    <w:bookmarkEnd w:id="38"/>
+    <w:bookmarkStart w:id="41" w:name="календарь-stub"/>
     <w:p>
       <w:pPr>
         <w:pStyle w:val="Heading2"/>
@@ -3999,7 +4762,7 @@
         <w:t xml:space="preserve">8. Календарь (stub)</w:t>
       </w:r>
     </w:p>
-    <w:bookmarkStart w:id="34" w:name="текущее-состояние-1"/>
+    <w:bookmarkStart w:id="39" w:name="текущее-состояние-1"/>
     <w:p>
       <w:pPr>
         <w:pStyle w:val="Heading3"/>
@@ -4029,8 +4792,8 @@
         <w:t xml:space="preserve">, синхронизация отложена.</w:t>
       </w:r>
     </w:p>
-    <w:bookmarkEnd w:id="34"/>
-    <w:bookmarkStart w:id="35" w:name="что-понадобится-для-live-перспектива-1"/>
+    <w:bookmarkEnd w:id="39"/>
+    <w:bookmarkStart w:id="40" w:name="что-понадобится-для-live-перспектива-1"/>
     <w:p>
       <w:pPr>
         <w:pStyle w:val="Heading3"/>
@@ -4044,7 +4807,7 @@
         <w:pStyle w:val="Compact"/>
         <w:numPr>
           <w:ilvl w:val="0"/>
-          <w:numId w:val="1027"/>
+          <w:numId w:val="1032"/>
         </w:numPr>
       </w:pPr>
       <w:r>
@@ -4059,7 +4822,7 @@
         <w:pStyle w:val="Compact"/>
         <w:numPr>
           <w:ilvl w:val="0"/>
-          <w:numId w:val="1027"/>
+          <w:numId w:val="1032"/>
         </w:numPr>
       </w:pPr>
       <w:r>
@@ -4093,7 +4856,7 @@
         <w:pStyle w:val="Compact"/>
         <w:numPr>
           <w:ilvl w:val="0"/>
-          <w:numId w:val="1027"/>
+          <w:numId w:val="1032"/>
         </w:numPr>
       </w:pPr>
       <w:r>
@@ -4108,7 +4871,7 @@
         <w:pStyle w:val="Compact"/>
         <w:numPr>
           <w:ilvl w:val="0"/>
-          <w:numId w:val="1027"/>
+          <w:numId w:val="1032"/>
         </w:numPr>
       </w:pPr>
       <w:r>
@@ -4130,9 +4893,9 @@
         </w:pict>
       </w:r>
     </w:p>
-    <w:bookmarkEnd w:id="35"/>
-    <w:bookmarkEnd w:id="36"/>
-    <w:bookmarkStart w:id="37" w:name="ручной-email-в-crm-без-gmail-oauth"/>
+    <w:bookmarkEnd w:id="40"/>
+    <w:bookmarkEnd w:id="41"/>
+    <w:bookmarkStart w:id="42" w:name="ручной-email-в-crm-без-gmail-oauth"/>
     <w:p>
       <w:pPr>
         <w:pStyle w:val="Heading2"/>
@@ -4170,7 +4933,7 @@
         <w:pStyle w:val="Compact"/>
         <w:numPr>
           <w:ilvl w:val="0"/>
-          <w:numId w:val="1028"/>
+          <w:numId w:val="1033"/>
         </w:numPr>
       </w:pPr>
       <w:r>
@@ -4201,7 +4964,7 @@
         <w:pStyle w:val="Compact"/>
         <w:numPr>
           <w:ilvl w:val="0"/>
-          <w:numId w:val="1028"/>
+          <w:numId w:val="1033"/>
         </w:numPr>
       </w:pPr>
       <w:r>
@@ -4245,7 +5008,7 @@
         <w:pStyle w:val="Compact"/>
         <w:numPr>
           <w:ilvl w:val="0"/>
-          <w:numId w:val="1028"/>
+          <w:numId w:val="1033"/>
         </w:numPr>
       </w:pPr>
       <w:r>
@@ -4289,7 +5052,7 @@
         <w:pStyle w:val="Compact"/>
         <w:numPr>
           <w:ilvl w:val="0"/>
-          <w:numId w:val="1028"/>
+          <w:numId w:val="1033"/>
         </w:numPr>
       </w:pPr>
       <w:r>
@@ -4346,8 +5109,8 @@
         </w:pict>
       </w:r>
     </w:p>
-    <w:bookmarkEnd w:id="37"/>
-    <w:bookmarkStart w:id="38" w:name="типовой-сценарий-настройки-с-нуля-admin"/>
+    <w:bookmarkEnd w:id="42"/>
+    <w:bookmarkStart w:id="43" w:name="типовой-сценарий-настройки-с-нуля-admin"/>
     <w:p>
       <w:pPr>
         <w:pStyle w:val="Heading2"/>
@@ -4361,7 +5124,7 @@
         <w:pStyle w:val="Compact"/>
         <w:numPr>
           <w:ilvl w:val="0"/>
-          <w:numId w:val="1029"/>
+          <w:numId w:val="1034"/>
         </w:numPr>
       </w:pPr>
       <w:r>
@@ -4377,32 +5140,23 @@
         <w:t xml:space="preserve">/settings</w:t>
       </w:r>
       <w:r>
-        <w:t xml:space="preserve">.</w:t>
-      </w:r>
-      <w:r>
-        <w:br/>
-      </w:r>
-    </w:p>
-    <w:p>
-      <w:pPr>
-        <w:pStyle w:val="Compact"/>
-        <w:numPr>
-          <w:ilvl w:val="0"/>
-          <w:numId w:val="1029"/>
-        </w:numPr>
-      </w:pPr>
+        <w:t xml:space="preserve"> </w:t>
+      </w:r>
+      <w:r>
+        <w:t xml:space="preserve">(вкладка</w:t>
+      </w:r>
+      <w:r>
+        <w:t xml:space="preserve"> </w:t>
+      </w:r>
       <w:r>
         <w:rPr>
           <w:b/>
           <w:bCs/>
         </w:rPr>
-        <w:t xml:space="preserve">Модули:</w:t>
-      </w:r>
-      <w:r>
-        <w:t xml:space="preserve"> </w:t>
-      </w:r>
-      <w:r>
-        <w:t xml:space="preserve">включить Communications, Analytics, AI → Сохранить.</w:t>
+        <w:t xml:space="preserve">Люди</w:t>
+      </w:r>
+      <w:r>
+        <w:t xml:space="preserve">).</w:t>
       </w:r>
       <w:r>
         <w:br/>
@@ -4413,7 +5167,7 @@
         <w:pStyle w:val="Compact"/>
         <w:numPr>
           <w:ilvl w:val="0"/>
-          <w:numId w:val="1029"/>
+          <w:numId w:val="1034"/>
         </w:numPr>
       </w:pPr>
       <w:r>
@@ -4421,13 +5175,25 @@
           <w:b/>
           <w:bCs/>
         </w:rPr>
-        <w:t xml:space="preserve">Аналитика:</w:t>
-      </w:r>
-      <w:r>
-        <w:t xml:space="preserve"> </w:t>
-      </w:r>
-      <w:r>
-        <w:t xml:space="preserve">выставить пороги (например 7 / 7) → Сохранить.</w:t>
+        <w:t xml:space="preserve">Люди:</w:t>
+      </w:r>
+      <w:r>
+        <w:t xml:space="preserve"> </w:t>
+      </w:r>
+      <w:r>
+        <w:t xml:space="preserve">при необходимости создать менеджера(ов) с ролью</w:t>
+      </w:r>
+      <w:r>
+        <w:t xml:space="preserve"> </w:t>
+      </w:r>
+      <w:r>
+        <w:rPr>
+          <w:rStyle w:val="VerbatimChar"/>
+        </w:rPr>
+        <w:t xml:space="preserve">manager</w:t>
+      </w:r>
+      <w:r>
+        <w:t xml:space="preserve">, выдать роли.</w:t>
       </w:r>
       <w:r>
         <w:br/>
@@ -4438,7 +5204,7 @@
         <w:pStyle w:val="Compact"/>
         <w:numPr>
           <w:ilvl w:val="0"/>
-          <w:numId w:val="1029"/>
+          <w:numId w:val="1034"/>
         </w:numPr>
       </w:pPr>
       <w:r>
@@ -4446,28 +5212,13 @@
           <w:b/>
           <w:bCs/>
         </w:rPr>
-        <w:t xml:space="preserve">Telegram:</w:t>
-      </w:r>
-      <w:r>
-        <w:t xml:space="preserve"> </w:t>
-      </w:r>
-      <w:r>
-        <w:t xml:space="preserve">BotFather → токен →</w:t>
-      </w:r>
-      <w:r>
-        <w:t xml:space="preserve"> </w:t>
-      </w:r>
-      <w:r>
-        <w:rPr>
-          <w:rStyle w:val="VerbatimChar"/>
-        </w:rPr>
-        <w:t xml:space="preserve">.env</w:t>
-      </w:r>
-      <w:r>
-        <w:t xml:space="preserve"> </w:t>
-      </w:r>
-      <w:r>
-        <w:t xml:space="preserve">→ restart API → статус live.</w:t>
+        <w:t xml:space="preserve">Модули:</w:t>
+      </w:r>
+      <w:r>
+        <w:t xml:space="preserve"> </w:t>
+      </w:r>
+      <w:r>
+        <w:t xml:space="preserve">включить Communications, Analytics, AI → Сохранить.</w:t>
       </w:r>
       <w:r>
         <w:br/>
@@ -4478,39 +5229,21 @@
         <w:pStyle w:val="Compact"/>
         <w:numPr>
           <w:ilvl w:val="0"/>
-          <w:numId w:val="1029"/>
-        </w:numPr>
-      </w:pPr>
-      <w:r>
-        <w:t xml:space="preserve">Создать/открыть контакт → указать Telegram Chat ID.</w:t>
-      </w:r>
-      <w:r>
-        <w:br/>
-      </w:r>
-    </w:p>
-    <w:p>
-      <w:pPr>
-        <w:pStyle w:val="Compact"/>
-        <w:numPr>
-          <w:ilvl w:val="0"/>
-          <w:numId w:val="1029"/>
-        </w:numPr>
-      </w:pPr>
-      <w:r>
-        <w:t xml:space="preserve">Клиент пишет боту →</w:t>
-      </w:r>
-      <w:r>
-        <w:t xml:space="preserve"> </w:t>
-      </w:r>
+          <w:numId w:val="1034"/>
+        </w:numPr>
+      </w:pPr>
       <w:r>
         <w:rPr>
           <w:b/>
           <w:bCs/>
         </w:rPr>
-        <w:t xml:space="preserve">Опрос Telegram</w:t>
-      </w:r>
-      <w:r>
-        <w:t xml:space="preserve">.</w:t>
+        <w:t xml:space="preserve">Аналитика:</w:t>
+      </w:r>
+      <w:r>
+        <w:t xml:space="preserve"> </w:t>
+      </w:r>
+      <w:r>
+        <w:t xml:space="preserve">вкладка → выставить пороги (например 7 / 7) → Сохранить.</w:t>
       </w:r>
       <w:r>
         <w:br/>
@@ -4521,7 +5254,7 @@
         <w:pStyle w:val="Compact"/>
         <w:numPr>
           <w:ilvl w:val="0"/>
-          <w:numId w:val="1029"/>
+          <w:numId w:val="1034"/>
         </w:numPr>
       </w:pPr>
       <w:r>
@@ -4529,6 +5262,89 @@
           <w:b/>
           <w:bCs/>
         </w:rPr>
+        <w:t xml:space="preserve">Telegram:</w:t>
+      </w:r>
+      <w:r>
+        <w:t xml:space="preserve"> </w:t>
+      </w:r>
+      <w:r>
+        <w:t xml:space="preserve">BotFather → токен →</w:t>
+      </w:r>
+      <w:r>
+        <w:t xml:space="preserve"> </w:t>
+      </w:r>
+      <w:r>
+        <w:rPr>
+          <w:rStyle w:val="VerbatimChar"/>
+        </w:rPr>
+        <w:t xml:space="preserve">.env</w:t>
+      </w:r>
+      <w:r>
+        <w:t xml:space="preserve"> </w:t>
+      </w:r>
+      <w:r>
+        <w:t xml:space="preserve">→ restart API → статус live.</w:t>
+      </w:r>
+      <w:r>
+        <w:br/>
+      </w:r>
+    </w:p>
+    <w:p>
+      <w:pPr>
+        <w:pStyle w:val="Compact"/>
+        <w:numPr>
+          <w:ilvl w:val="0"/>
+          <w:numId w:val="1034"/>
+        </w:numPr>
+      </w:pPr>
+      <w:r>
+        <w:t xml:space="preserve">Создать/открыть контакт → указать Telegram Chat ID.</w:t>
+      </w:r>
+      <w:r>
+        <w:br/>
+      </w:r>
+    </w:p>
+    <w:p>
+      <w:pPr>
+        <w:pStyle w:val="Compact"/>
+        <w:numPr>
+          <w:ilvl w:val="0"/>
+          <w:numId w:val="1034"/>
+        </w:numPr>
+      </w:pPr>
+      <w:r>
+        <w:t xml:space="preserve">Клиент пишет боту →</w:t>
+      </w:r>
+      <w:r>
+        <w:t xml:space="preserve"> </w:t>
+      </w:r>
+      <w:r>
+        <w:rPr>
+          <w:b/>
+          <w:bCs/>
+        </w:rPr>
+        <w:t xml:space="preserve">Опрос Telegram</w:t>
+      </w:r>
+      <w:r>
+        <w:t xml:space="preserve">.</w:t>
+      </w:r>
+      <w:r>
+        <w:br/>
+      </w:r>
+    </w:p>
+    <w:p>
+      <w:pPr>
+        <w:pStyle w:val="Compact"/>
+        <w:numPr>
+          <w:ilvl w:val="0"/>
+          <w:numId w:val="1034"/>
+        </w:numPr>
+      </w:pPr>
+      <w:r>
+        <w:rPr>
+          <w:b/>
+          <w:bCs/>
+        </w:rPr>
         <w:t xml:space="preserve">OpenAI:</w:t>
       </w:r>
       <w:r>
@@ -4582,7 +5398,7 @@
         <w:pStyle w:val="Compact"/>
         <w:numPr>
           <w:ilvl w:val="0"/>
-          <w:numId w:val="1029"/>
+          <w:numId w:val="1034"/>
         </w:numPr>
       </w:pPr>
       <w:r>
@@ -4596,8 +5412,8 @@
         </w:pict>
       </w:r>
     </w:p>
-    <w:bookmarkEnd w:id="38"/>
-    <w:bookmarkStart w:id="39" w:name="где-что-править-кратко"/>
+    <w:bookmarkEnd w:id="43"/>
+    <w:bookmarkStart w:id="44" w:name="где-что-править-кратко"/>
     <w:p>
       <w:pPr>
         <w:pStyle w:val="Heading2"/>
@@ -4664,6 +5480,44 @@
               <w:pStyle w:val="Compact"/>
             </w:pPr>
             <w:r>
+              <w:t xml:space="preserve">Люди / роли / отзыв доступа</w:t>
+            </w:r>
+          </w:p>
+        </w:tc>
+        <w:tc>
+          <w:tcPr/>
+          <w:p>
+            <w:pPr>
+              <w:pStyle w:val="Compact"/>
+            </w:pPr>
+            <w:r>
+              <w:rPr>
+                <w:rStyle w:val="VerbatimChar"/>
+              </w:rPr>
+              <w:t xml:space="preserve">/settings?tab=users</w:t>
+            </w:r>
+          </w:p>
+        </w:tc>
+        <w:tc>
+          <w:tcPr/>
+          <w:p>
+            <w:pPr>
+              <w:pStyle w:val="Compact"/>
+            </w:pPr>
+            <w:r>
+              <w:t xml:space="preserve">—</w:t>
+            </w:r>
+          </w:p>
+        </w:tc>
+      </w:tr>
+      <w:tr>
+        <w:tc>
+          <w:tcPr/>
+          <w:p>
+            <w:pPr>
+              <w:pStyle w:val="Compact"/>
+            </w:pPr>
+            <w:r>
               <w:t xml:space="preserve">Модули</w:t>
             </w:r>
           </w:p>
@@ -4716,7 +5570,7 @@
               <w:rPr>
                 <w:rStyle w:val="VerbatimChar"/>
               </w:rPr>
-              <w:t xml:space="preserve">/settings</w:t>
+              <w:t xml:space="preserve">/settings?tab=analytics</w:t>
             </w:r>
           </w:p>
         </w:tc>
@@ -4956,8 +5810,8 @@
         </w:pict>
       </w:r>
     </w:p>
-    <w:bookmarkEnd w:id="39"/>
-    <w:bookmarkStart w:id="40" w:name="полезные-ссылки-сводка"/>
+    <w:bookmarkEnd w:id="44"/>
+    <w:bookmarkStart w:id="45" w:name="полезные-ссылки-сводка"/>
     <w:p>
       <w:pPr>
         <w:pStyle w:val="Heading2"/>
@@ -5036,18 +5890,42 @@
               <w:pStyle w:val="Compact"/>
             </w:pPr>
             <w:r>
-              <w:t xml:space="preserve">Настройки</w:t>
-            </w:r>
-          </w:p>
-        </w:tc>
-        <w:tc>
-          <w:tcPr/>
-          <w:p>
-            <w:pPr>
-              <w:pStyle w:val="Compact"/>
-            </w:pPr>
-            <w:r>
-              <w:t xml:space="preserve">https://testfullcrm.alexklyvibe.ru/settings</w:t>
+              <w:t xml:space="preserve">Настройки / Люди</w:t>
+            </w:r>
+          </w:p>
+        </w:tc>
+        <w:tc>
+          <w:tcPr/>
+          <w:p>
+            <w:pPr>
+              <w:pStyle w:val="Compact"/>
+            </w:pPr>
+            <w:r>
+              <w:t xml:space="preserve">https://testfullcrm.alexklyvibe.ru/settings?tab=users</w:t>
+            </w:r>
+          </w:p>
+        </w:tc>
+      </w:tr>
+      <w:tr>
+        <w:tc>
+          <w:tcPr/>
+          <w:p>
+            <w:pPr>
+              <w:pStyle w:val="Compact"/>
+            </w:pPr>
+            <w:r>
+              <w:t xml:space="preserve">Аналитика (пороги)</w:t>
+            </w:r>
+          </w:p>
+        </w:tc>
+        <w:tc>
+          <w:tcPr/>
+          <w:p>
+            <w:pPr>
+              <w:pStyle w:val="Compact"/>
+            </w:pPr>
+            <w:r>
+              <w:t xml:space="preserve">https://testfullcrm.alexklyvibe.ru/settings?tab=analytics</w:t>
             </w:r>
           </w:p>
         </w:tc>
@@ -5333,11 +6211,11 @@
           <w:i/>
           <w:iCs/>
         </w:rPr>
-        <w:t xml:space="preserve">Версия инструкции соответствует MVP FullCRM с модулями CRM / Communications / Analytics / AI и интеграциями Telegram (live) + Gmail/Calendar (stub).</w:t>
-      </w:r>
-    </w:p>
-    <w:bookmarkEnd w:id="40"/>
-    <w:bookmarkEnd w:id="41"/>
+        <w:t xml:space="preserve">Версия инструкции соответствует MVP FullCRM: люди/роли из UI, модули CRM / Communications / Analytics / AI, интеграции Telegram (live) + Gmail/Calendar (stub).</w:t>
+      </w:r>
+    </w:p>
+    <w:bookmarkEnd w:id="45"/>
+    <w:bookmarkEnd w:id="46"/>
     <w:sectPr>
       <w:footnotePr>
         <w:numRestart w:val="eachSect"/>
@@ -5831,13 +6709,67 @@
     </w:lvlOverride>
   </w:num>
   <w:num w:numId="1002">
-    <w:abstractNumId w:val="991"/>
+    <w:abstractNumId w:val="99411"/>
+    <w:lvlOverride w:ilvl="0">
+      <w:startOverride w:val="1"/>
+    </w:lvlOverride>
+    <w:lvlOverride w:ilvl="1">
+      <w:startOverride w:val="1"/>
+    </w:lvlOverride>
+    <w:lvlOverride w:ilvl="2">
+      <w:startOverride w:val="1"/>
+    </w:lvlOverride>
+    <w:lvlOverride w:ilvl="3">
+      <w:startOverride w:val="1"/>
+    </w:lvlOverride>
+    <w:lvlOverride w:ilvl="4">
+      <w:startOverride w:val="1"/>
+    </w:lvlOverride>
+    <w:lvlOverride w:ilvl="5">
+      <w:startOverride w:val="1"/>
+    </w:lvlOverride>
+    <w:lvlOverride w:ilvl="6">
+      <w:startOverride w:val="1"/>
+    </w:lvlOverride>
+    <w:lvlOverride w:ilvl="7">
+      <w:startOverride w:val="1"/>
+    </w:lvlOverride>
+    <w:lvlOverride w:ilvl="8">
+      <w:startOverride w:val="1"/>
+    </w:lvlOverride>
   </w:num>
   <w:num w:numId="1003">
     <w:abstractNumId w:val="991"/>
   </w:num>
   <w:num w:numId="1004">
-    <w:abstractNumId w:val="991"/>
+    <w:abstractNumId w:val="99411"/>
+    <w:lvlOverride w:ilvl="0">
+      <w:startOverride w:val="1"/>
+    </w:lvlOverride>
+    <w:lvlOverride w:ilvl="1">
+      <w:startOverride w:val="1"/>
+    </w:lvlOverride>
+    <w:lvlOverride w:ilvl="2">
+      <w:startOverride w:val="1"/>
+    </w:lvlOverride>
+    <w:lvlOverride w:ilvl="3">
+      <w:startOverride w:val="1"/>
+    </w:lvlOverride>
+    <w:lvlOverride w:ilvl="4">
+      <w:startOverride w:val="1"/>
+    </w:lvlOverride>
+    <w:lvlOverride w:ilvl="5">
+      <w:startOverride w:val="1"/>
+    </w:lvlOverride>
+    <w:lvlOverride w:ilvl="6">
+      <w:startOverride w:val="1"/>
+    </w:lvlOverride>
+    <w:lvlOverride w:ilvl="7">
+      <w:startOverride w:val="1"/>
+    </w:lvlOverride>
+    <w:lvlOverride w:ilvl="8">
+      <w:startOverride w:val="1"/>
+    </w:lvlOverride>
   </w:num>
   <w:num w:numId="1005">
     <w:abstractNumId w:val="99411"/>
@@ -5870,6 +6802,18 @@
     </w:lvlOverride>
   </w:num>
   <w:num w:numId="1006">
+    <w:abstractNumId w:val="991"/>
+  </w:num>
+  <w:num w:numId="1007">
+    <w:abstractNumId w:val="991"/>
+  </w:num>
+  <w:num w:numId="1008">
+    <w:abstractNumId w:val="991"/>
+  </w:num>
+  <w:num w:numId="1009">
+    <w:abstractNumId w:val="991"/>
+  </w:num>
+  <w:num w:numId="1010">
     <w:abstractNumId w:val="99411"/>
     <w:lvlOverride w:ilvl="0">
       <w:startOverride w:val="1"/>
@@ -5899,7 +6843,7 @@
       <w:startOverride w:val="1"/>
     </w:lvlOverride>
   </w:num>
-  <w:num w:numId="1007">
+  <w:num w:numId="1011">
     <w:abstractNumId w:val="99411"/>
     <w:lvlOverride w:ilvl="0">
       <w:startOverride w:val="1"/>
@@ -5929,7 +6873,37 @@
       <w:startOverride w:val="1"/>
     </w:lvlOverride>
   </w:num>
-  <w:num w:numId="1008">
+  <w:num w:numId="1012">
+    <w:abstractNumId w:val="99411"/>
+    <w:lvlOverride w:ilvl="0">
+      <w:startOverride w:val="1"/>
+    </w:lvlOverride>
+    <w:lvlOverride w:ilvl="1">
+      <w:startOverride w:val="1"/>
+    </w:lvlOverride>
+    <w:lvlOverride w:ilvl="2">
+      <w:startOverride w:val="1"/>
+    </w:lvlOverride>
+    <w:lvlOverride w:ilvl="3">
+      <w:startOverride w:val="1"/>
+    </w:lvlOverride>
+    <w:lvlOverride w:ilvl="4">
+      <w:startOverride w:val="1"/>
+    </w:lvlOverride>
+    <w:lvlOverride w:ilvl="5">
+      <w:startOverride w:val="1"/>
+    </w:lvlOverride>
+    <w:lvlOverride w:ilvl="6">
+      <w:startOverride w:val="1"/>
+    </w:lvlOverride>
+    <w:lvlOverride w:ilvl="7">
+      <w:startOverride w:val="1"/>
+    </w:lvlOverride>
+    <w:lvlOverride w:ilvl="8">
+      <w:startOverride w:val="1"/>
+    </w:lvlOverride>
+  </w:num>
+  <w:num w:numId="1013">
     <w:abstractNumId w:val="99413"/>
     <w:lvlOverride w:ilvl="0">
       <w:startOverride w:val="3"/>
@@ -5959,7 +6933,7 @@
       <w:startOverride w:val="3"/>
     </w:lvlOverride>
   </w:num>
-  <w:num w:numId="1009">
+  <w:num w:numId="1014">
     <w:abstractNumId w:val="99411"/>
     <w:lvlOverride w:ilvl="0">
       <w:startOverride w:val="1"/>
@@ -5988,21 +6962,6 @@
     <w:lvlOverride w:ilvl="8">
       <w:startOverride w:val="1"/>
     </w:lvlOverride>
-  </w:num>
-  <w:num w:numId="1010">
-    <w:abstractNumId w:val="992"/>
-  </w:num>
-  <w:num w:numId="1011">
-    <w:abstractNumId w:val="992"/>
-  </w:num>
-  <w:num w:numId="1012">
-    <w:abstractNumId w:val="992"/>
-  </w:num>
-  <w:num w:numId="1013">
-    <w:abstractNumId w:val="992"/>
-  </w:num>
-  <w:num w:numId="1014">
-    <w:abstractNumId w:val="992"/>
   </w:num>
   <w:num w:numId="1015">
     <w:abstractNumId w:val="992"/>
@@ -6011,67 +6970,13 @@
     <w:abstractNumId w:val="992"/>
   </w:num>
   <w:num w:numId="1017">
-    <w:abstractNumId w:val="991"/>
+    <w:abstractNumId w:val="992"/>
   </w:num>
   <w:num w:numId="1018">
-    <w:abstractNumId w:val="99411"/>
-    <w:lvlOverride w:ilvl="0">
-      <w:startOverride w:val="1"/>
-    </w:lvlOverride>
-    <w:lvlOverride w:ilvl="1">
-      <w:startOverride w:val="1"/>
-    </w:lvlOverride>
-    <w:lvlOverride w:ilvl="2">
-      <w:startOverride w:val="1"/>
-    </w:lvlOverride>
-    <w:lvlOverride w:ilvl="3">
-      <w:startOverride w:val="1"/>
-    </w:lvlOverride>
-    <w:lvlOverride w:ilvl="4">
-      <w:startOverride w:val="1"/>
-    </w:lvlOverride>
-    <w:lvlOverride w:ilvl="5">
-      <w:startOverride w:val="1"/>
-    </w:lvlOverride>
-    <w:lvlOverride w:ilvl="6">
-      <w:startOverride w:val="1"/>
-    </w:lvlOverride>
-    <w:lvlOverride w:ilvl="7">
-      <w:startOverride w:val="1"/>
-    </w:lvlOverride>
-    <w:lvlOverride w:ilvl="8">
-      <w:startOverride w:val="1"/>
-    </w:lvlOverride>
+    <w:abstractNumId w:val="992"/>
   </w:num>
   <w:num w:numId="1019">
-    <w:abstractNumId w:val="99411"/>
-    <w:lvlOverride w:ilvl="0">
-      <w:startOverride w:val="1"/>
-    </w:lvlOverride>
-    <w:lvlOverride w:ilvl="1">
-      <w:startOverride w:val="1"/>
-    </w:lvlOverride>
-    <w:lvlOverride w:ilvl="2">
-      <w:startOverride w:val="1"/>
-    </w:lvlOverride>
-    <w:lvlOverride w:ilvl="3">
-      <w:startOverride w:val="1"/>
-    </w:lvlOverride>
-    <w:lvlOverride w:ilvl="4">
-      <w:startOverride w:val="1"/>
-    </w:lvlOverride>
-    <w:lvlOverride w:ilvl="5">
-      <w:startOverride w:val="1"/>
-    </w:lvlOverride>
-    <w:lvlOverride w:ilvl="6">
-      <w:startOverride w:val="1"/>
-    </w:lvlOverride>
-    <w:lvlOverride w:ilvl="7">
-      <w:startOverride w:val="1"/>
-    </w:lvlOverride>
-    <w:lvlOverride w:ilvl="8">
-      <w:startOverride w:val="1"/>
-    </w:lvlOverride>
+    <w:abstractNumId w:val="992"/>
   </w:num>
   <w:num w:numId="1020">
     <w:abstractNumId w:val="992"/>
@@ -6080,18 +6985,87 @@
     <w:abstractNumId w:val="992"/>
   </w:num>
   <w:num w:numId="1022">
+    <w:abstractNumId w:val="991"/>
+  </w:num>
+  <w:num w:numId="1023">
+    <w:abstractNumId w:val="99411"/>
+    <w:lvlOverride w:ilvl="0">
+      <w:startOverride w:val="1"/>
+    </w:lvlOverride>
+    <w:lvlOverride w:ilvl="1">
+      <w:startOverride w:val="1"/>
+    </w:lvlOverride>
+    <w:lvlOverride w:ilvl="2">
+      <w:startOverride w:val="1"/>
+    </w:lvlOverride>
+    <w:lvlOverride w:ilvl="3">
+      <w:startOverride w:val="1"/>
+    </w:lvlOverride>
+    <w:lvlOverride w:ilvl="4">
+      <w:startOverride w:val="1"/>
+    </w:lvlOverride>
+    <w:lvlOverride w:ilvl="5">
+      <w:startOverride w:val="1"/>
+    </w:lvlOverride>
+    <w:lvlOverride w:ilvl="6">
+      <w:startOverride w:val="1"/>
+    </w:lvlOverride>
+    <w:lvlOverride w:ilvl="7">
+      <w:startOverride w:val="1"/>
+    </w:lvlOverride>
+    <w:lvlOverride w:ilvl="8">
+      <w:startOverride w:val="1"/>
+    </w:lvlOverride>
+  </w:num>
+  <w:num w:numId="1024">
+    <w:abstractNumId w:val="99411"/>
+    <w:lvlOverride w:ilvl="0">
+      <w:startOverride w:val="1"/>
+    </w:lvlOverride>
+    <w:lvlOverride w:ilvl="1">
+      <w:startOverride w:val="1"/>
+    </w:lvlOverride>
+    <w:lvlOverride w:ilvl="2">
+      <w:startOverride w:val="1"/>
+    </w:lvlOverride>
+    <w:lvlOverride w:ilvl="3">
+      <w:startOverride w:val="1"/>
+    </w:lvlOverride>
+    <w:lvlOverride w:ilvl="4">
+      <w:startOverride w:val="1"/>
+    </w:lvlOverride>
+    <w:lvlOverride w:ilvl="5">
+      <w:startOverride w:val="1"/>
+    </w:lvlOverride>
+    <w:lvlOverride w:ilvl="6">
+      <w:startOverride w:val="1"/>
+    </w:lvlOverride>
+    <w:lvlOverride w:ilvl="7">
+      <w:startOverride w:val="1"/>
+    </w:lvlOverride>
+    <w:lvlOverride w:ilvl="8">
+      <w:startOverride w:val="1"/>
+    </w:lvlOverride>
+  </w:num>
+  <w:num w:numId="1025">
     <w:abstractNumId w:val="992"/>
   </w:num>
-  <w:num w:numId="1023">
+  <w:num w:numId="1026">
     <w:abstractNumId w:val="992"/>
   </w:num>
-  <w:num w:numId="1024">
+  <w:num w:numId="1027">
     <w:abstractNumId w:val="992"/>
   </w:num>
-  <w:num w:numId="1025">
+  <w:num w:numId="1028">
+    <w:abstractNumId w:val="992"/>
+  </w:num>
+  <w:num w:numId="1029">
+    <w:abstractNumId w:val="992"/>
+  </w:num>
+  <w:num w:numId="1030">
     <w:abstractNumId w:val="991"/>
   </w:num>
-  <w:num w:numId="1026">
+  <w:num w:numId="1031">
     <w:abstractNumId w:val="99411"/>
     <w:lvlOverride w:ilvl="0">
       <w:startOverride w:val="1"/>
@@ -6121,7 +7095,7 @@
       <w:startOverride w:val="1"/>
     </w:lvlOverride>
   </w:num>
-  <w:num w:numId="1027">
+  <w:num w:numId="1032">
     <w:abstractNumId w:val="99411"/>
     <w:lvlOverride w:ilvl="0">
       <w:startOverride w:val="1"/>
@@ -6151,7 +7125,7 @@
       <w:startOverride w:val="1"/>
     </w:lvlOverride>
   </w:num>
-  <w:num w:numId="1028">
+  <w:num w:numId="1033">
     <w:abstractNumId w:val="99411"/>
     <w:lvlOverride w:ilvl="0">
       <w:startOverride w:val="1"/>
@@ -6181,7 +7155,7 @@
       <w:startOverride w:val="1"/>
     </w:lvlOverride>
   </w:num>
-  <w:num w:numId="1029">
+  <w:num w:numId="1034">
     <w:abstractNumId w:val="99411"/>
     <w:lvlOverride w:ilvl="0">
       <w:startOverride w:val="1"/>

</xml_diff>